<commit_message>
Adding asp.net core notes
</commit_message>
<xml_diff>
--- a/ASP.net-Core/asp.net-core-notes-06.docx
+++ b/ASP.net-Core/asp.net-core-notes-06.docx
@@ -52,7 +52,6 @@
         </w:rPr>
         <w:t xml:space="preserve">a more convenient way called owned entity types. You can use the </w:t>
       </w:r>
-      <w:proofErr w:type="gramStart"/>
       <w:r>
         <w:rPr>
           <w:rFonts w:ascii="Sakkal Majalla" w:hAnsi="Sakkal Majalla" w:cs="Sakkal Majalla"/>
@@ -68,16 +67,7 @@
           <w:sz w:val="28"/>
           <w:szCs w:val="28"/>
         </w:rPr>
-        <w:t>(</w:t>
-      </w:r>
-      <w:proofErr w:type="gramEnd"/>
-      <w:r>
-        <w:rPr>
-          <w:rFonts w:ascii="Sakkal Majalla" w:hAnsi="Sakkal Majalla" w:cs="Sakkal Majalla"/>
-          <w:sz w:val="28"/>
-          <w:szCs w:val="28"/>
-        </w:rPr>
-        <w:t xml:space="preserve">) or </w:t>
+        <w:t xml:space="preserve">() or </w:t>
       </w:r>
       <w:r>
         <w:rPr>
@@ -181,7 +171,6 @@
         </w:rPr>
         <w:t xml:space="preserve">    </w:t>
       </w:r>
-      <w:proofErr w:type="gramStart"/>
       <w:r>
         <w:rPr>
           <w:rFonts w:ascii="Cascadia Mono" w:hAnsi="Cascadia Mono" w:cs="Cascadia Mono"/>
@@ -192,7 +181,6 @@
         </w:rPr>
         <w:t>public</w:t>
       </w:r>
-      <w:proofErr w:type="gramEnd"/>
       <w:r>
         <w:rPr>
           <w:rFonts w:ascii="Cascadia Mono" w:hAnsi="Cascadia Mono" w:cs="Cascadia Mono"/>
@@ -303,7 +291,6 @@
         </w:rPr>
         <w:t xml:space="preserve">        </w:t>
       </w:r>
-      <w:proofErr w:type="gramStart"/>
       <w:r>
         <w:rPr>
           <w:rFonts w:ascii="Cascadia Mono" w:hAnsi="Cascadia Mono" w:cs="Cascadia Mono"/>
@@ -314,7 +301,6 @@
         </w:rPr>
         <w:t>public</w:t>
       </w:r>
-      <w:proofErr w:type="gramEnd"/>
       <w:r>
         <w:rPr>
           <w:rFonts w:ascii="Cascadia Mono" w:hAnsi="Cascadia Mono" w:cs="Cascadia Mono"/>
@@ -500,27 +486,15 @@
         </w:rPr>
         <w:t>Invoice</w:t>
       </w:r>
-      <w:proofErr w:type="gramStart"/>
-      <w:r>
-        <w:rPr>
-          <w:rFonts w:ascii="Cascadia Mono" w:hAnsi="Cascadia Mono" w:cs="Cascadia Mono"/>
-          <w:color w:val="000000"/>
-          <w:sz w:val="19"/>
-          <w:szCs w:val="19"/>
-          <w:highlight w:val="white"/>
-        </w:rPr>
-        <w:t>&gt;(</w:t>
-      </w:r>
-      <w:proofErr w:type="gramEnd"/>
-      <w:r>
-        <w:rPr>
-          <w:rFonts w:ascii="Cascadia Mono" w:hAnsi="Cascadia Mono" w:cs="Cascadia Mono"/>
-          <w:color w:val="000000"/>
-          <w:sz w:val="19"/>
-          <w:szCs w:val="19"/>
-          <w:highlight w:val="white"/>
-        </w:rPr>
-        <w:t>b =&gt;</w:t>
+      <w:r>
+        <w:rPr>
+          <w:rFonts w:ascii="Cascadia Mono" w:hAnsi="Cascadia Mono" w:cs="Cascadia Mono"/>
+          <w:color w:val="000000"/>
+          <w:sz w:val="19"/>
+          <w:szCs w:val="19"/>
+          <w:highlight w:val="white"/>
+        </w:rPr>
+        <w:t>&gt;(b =&gt;</w:t>
       </w:r>
     </w:p>
     <w:p>
@@ -570,20 +544,8 @@
           <w:szCs w:val="19"/>
           <w:highlight w:val="white"/>
         </w:rPr>
-        <w:t xml:space="preserve">                </w:t>
-      </w:r>
-      <w:proofErr w:type="gramStart"/>
-      <w:r>
-        <w:rPr>
-          <w:rFonts w:ascii="Cascadia Mono" w:hAnsi="Cascadia Mono" w:cs="Cascadia Mono"/>
-          <w:color w:val="000000"/>
-          <w:sz w:val="19"/>
-          <w:szCs w:val="19"/>
-          <w:highlight w:val="white"/>
-        </w:rPr>
-        <w:t>b.ToTable(</w:t>
-      </w:r>
-      <w:proofErr w:type="gramEnd"/>
+        <w:t xml:space="preserve">                b.ToTable(</w:t>
+      </w:r>
       <w:r>
         <w:rPr>
           <w:rFonts w:ascii="Cascadia Mono" w:hAnsi="Cascadia Mono" w:cs="Cascadia Mono"/>
@@ -627,29 +589,7 @@
           <w:szCs w:val="19"/>
           <w:highlight w:val="white"/>
         </w:rPr>
-        <w:t xml:space="preserve">                </w:t>
-      </w:r>
-      <w:proofErr w:type="gramStart"/>
-      <w:r>
-        <w:rPr>
-          <w:rFonts w:ascii="Cascadia Mono" w:hAnsi="Cascadia Mono" w:cs="Cascadia Mono"/>
-          <w:color w:val="000000"/>
-          <w:sz w:val="19"/>
-          <w:szCs w:val="19"/>
-          <w:highlight w:val="white"/>
-        </w:rPr>
-        <w:t>b.HasKey(</w:t>
-      </w:r>
-      <w:proofErr w:type="gramEnd"/>
-      <w:r>
-        <w:rPr>
-          <w:rFonts w:ascii="Cascadia Mono" w:hAnsi="Cascadia Mono" w:cs="Cascadia Mono"/>
-          <w:color w:val="000000"/>
-          <w:sz w:val="19"/>
-          <w:szCs w:val="19"/>
-          <w:highlight w:val="white"/>
-        </w:rPr>
-        <w:t>i =&gt; i.Id);</w:t>
+        <w:t xml:space="preserve">                b.HasKey(i =&gt; i.Id);</w:t>
       </w:r>
     </w:p>
     <w:p>
@@ -674,29 +614,7 @@
           <w:szCs w:val="19"/>
           <w:highlight w:val="white"/>
         </w:rPr>
-        <w:t xml:space="preserve">                </w:t>
-      </w:r>
-      <w:proofErr w:type="gramStart"/>
-      <w:r>
-        <w:rPr>
-          <w:rFonts w:ascii="Cascadia Mono" w:hAnsi="Cascadia Mono" w:cs="Cascadia Mono"/>
-          <w:color w:val="000000"/>
-          <w:sz w:val="19"/>
-          <w:szCs w:val="19"/>
-          <w:highlight w:val="white"/>
-        </w:rPr>
-        <w:t>b.Property(</w:t>
-      </w:r>
-      <w:proofErr w:type="gramEnd"/>
-      <w:r>
-        <w:rPr>
-          <w:rFonts w:ascii="Cascadia Mono" w:hAnsi="Cascadia Mono" w:cs="Cascadia Mono"/>
-          <w:color w:val="000000"/>
-          <w:sz w:val="19"/>
-          <w:szCs w:val="19"/>
-          <w:highlight w:val="white"/>
-        </w:rPr>
-        <w:t>p =&gt; p.Id).HasColumnName(</w:t>
+        <w:t xml:space="preserve">                b.Property(p =&gt; p.Id).HasColumnName(</w:t>
       </w:r>
       <w:r>
         <w:rPr>
@@ -741,29 +659,7 @@
           <w:szCs w:val="19"/>
           <w:highlight w:val="white"/>
         </w:rPr>
-        <w:t xml:space="preserve">                </w:t>
-      </w:r>
-      <w:proofErr w:type="gramStart"/>
-      <w:r>
-        <w:rPr>
-          <w:rFonts w:ascii="Cascadia Mono" w:hAnsi="Cascadia Mono" w:cs="Cascadia Mono"/>
-          <w:color w:val="000000"/>
-          <w:sz w:val="19"/>
-          <w:szCs w:val="19"/>
-          <w:highlight w:val="white"/>
-        </w:rPr>
-        <w:t>b.Property(</w:t>
-      </w:r>
-      <w:proofErr w:type="gramEnd"/>
-      <w:r>
-        <w:rPr>
-          <w:rFonts w:ascii="Cascadia Mono" w:hAnsi="Cascadia Mono" w:cs="Cascadia Mono"/>
-          <w:color w:val="000000"/>
-          <w:sz w:val="19"/>
-          <w:szCs w:val="19"/>
-          <w:highlight w:val="white"/>
-        </w:rPr>
-        <w:t>p =&gt; p.InvoiceNumber).HasColumnName(</w:t>
+        <w:t xml:space="preserve">                b.Property(p =&gt; p.InvoiceNumber).HasColumnName(</w:t>
       </w:r>
       <w:r>
         <w:rPr>
@@ -828,29 +724,7 @@
           <w:szCs w:val="19"/>
           <w:highlight w:val="white"/>
         </w:rPr>
-        <w:t xml:space="preserve">                </w:t>
-      </w:r>
-      <w:proofErr w:type="gramStart"/>
-      <w:r>
-        <w:rPr>
-          <w:rFonts w:ascii="Cascadia Mono" w:hAnsi="Cascadia Mono" w:cs="Cascadia Mono"/>
-          <w:color w:val="000000"/>
-          <w:sz w:val="19"/>
-          <w:szCs w:val="19"/>
-          <w:highlight w:val="white"/>
-        </w:rPr>
-        <w:t>b.Property(</w:t>
-      </w:r>
-      <w:proofErr w:type="gramEnd"/>
-      <w:r>
-        <w:rPr>
-          <w:rFonts w:ascii="Cascadia Mono" w:hAnsi="Cascadia Mono" w:cs="Cascadia Mono"/>
-          <w:color w:val="000000"/>
-          <w:sz w:val="19"/>
-          <w:szCs w:val="19"/>
-          <w:highlight w:val="white"/>
-        </w:rPr>
-        <w:t>p =&gt; p.ContactName).HasColumnName(</w:t>
+        <w:t xml:space="preserve">                b.Property(p =&gt; p.ContactName).HasColumnName(</w:t>
       </w:r>
       <w:r>
         <w:rPr>
@@ -895,29 +769,7 @@
           <w:szCs w:val="19"/>
           <w:highlight w:val="white"/>
         </w:rPr>
-        <w:t xml:space="preserve">                </w:t>
-      </w:r>
-      <w:proofErr w:type="gramStart"/>
-      <w:r>
-        <w:rPr>
-          <w:rFonts w:ascii="Cascadia Mono" w:hAnsi="Cascadia Mono" w:cs="Cascadia Mono"/>
-          <w:color w:val="000000"/>
-          <w:sz w:val="19"/>
-          <w:szCs w:val="19"/>
-          <w:highlight w:val="white"/>
-        </w:rPr>
-        <w:t>b.Property(</w:t>
-      </w:r>
-      <w:proofErr w:type="gramEnd"/>
-      <w:r>
-        <w:rPr>
-          <w:rFonts w:ascii="Cascadia Mono" w:hAnsi="Cascadia Mono" w:cs="Cascadia Mono"/>
-          <w:color w:val="000000"/>
-          <w:sz w:val="19"/>
-          <w:szCs w:val="19"/>
-          <w:highlight w:val="white"/>
-        </w:rPr>
-        <w:t>p =&gt; p.Description).HasColumnName(</w:t>
+        <w:t xml:space="preserve">                b.Property(p =&gt; p.Description).HasColumnName(</w:t>
       </w:r>
       <w:r>
         <w:rPr>
@@ -962,29 +814,7 @@
           <w:szCs w:val="19"/>
           <w:highlight w:val="white"/>
         </w:rPr>
-        <w:t xml:space="preserve">                </w:t>
-      </w:r>
-      <w:proofErr w:type="gramStart"/>
-      <w:r>
-        <w:rPr>
-          <w:rFonts w:ascii="Cascadia Mono" w:hAnsi="Cascadia Mono" w:cs="Cascadia Mono"/>
-          <w:color w:val="000000"/>
-          <w:sz w:val="19"/>
-          <w:szCs w:val="19"/>
-          <w:highlight w:val="white"/>
-        </w:rPr>
-        <w:t>b.Property(</w:t>
-      </w:r>
-      <w:proofErr w:type="gramEnd"/>
-      <w:r>
-        <w:rPr>
-          <w:rFonts w:ascii="Cascadia Mono" w:hAnsi="Cascadia Mono" w:cs="Cascadia Mono"/>
-          <w:color w:val="000000"/>
-          <w:sz w:val="19"/>
-          <w:szCs w:val="19"/>
-          <w:highlight w:val="white"/>
-        </w:rPr>
-        <w:t>p =&gt; p.Amount).HasColumnName(</w:t>
+        <w:t xml:space="preserve">                b.Property(p =&gt; p.Amount).HasColumnName(</w:t>
       </w:r>
       <w:r>
         <w:rPr>
@@ -1049,29 +879,7 @@
           <w:szCs w:val="19"/>
           <w:highlight w:val="white"/>
         </w:rPr>
-        <w:t xml:space="preserve">                </w:t>
-      </w:r>
-      <w:proofErr w:type="gramStart"/>
-      <w:r>
-        <w:rPr>
-          <w:rFonts w:ascii="Cascadia Mono" w:hAnsi="Cascadia Mono" w:cs="Cascadia Mono"/>
-          <w:color w:val="000000"/>
-          <w:sz w:val="19"/>
-          <w:szCs w:val="19"/>
-          <w:highlight w:val="white"/>
-        </w:rPr>
-        <w:t>b.Property(</w:t>
-      </w:r>
-      <w:proofErr w:type="gramEnd"/>
-      <w:r>
-        <w:rPr>
-          <w:rFonts w:ascii="Cascadia Mono" w:hAnsi="Cascadia Mono" w:cs="Cascadia Mono"/>
-          <w:color w:val="000000"/>
-          <w:sz w:val="19"/>
-          <w:szCs w:val="19"/>
-          <w:highlight w:val="white"/>
-        </w:rPr>
-        <w:t>p =&gt; p.Amount).HasColumnName(</w:t>
+        <w:t xml:space="preserve">                b.Property(p =&gt; p.Amount).HasColumnName(</w:t>
       </w:r>
       <w:r>
         <w:rPr>
@@ -1116,29 +924,7 @@
           <w:szCs w:val="19"/>
           <w:highlight w:val="white"/>
         </w:rPr>
-        <w:t xml:space="preserve">                </w:t>
-      </w:r>
-      <w:proofErr w:type="gramStart"/>
-      <w:r>
-        <w:rPr>
-          <w:rFonts w:ascii="Cascadia Mono" w:hAnsi="Cascadia Mono" w:cs="Cascadia Mono"/>
-          <w:color w:val="000000"/>
-          <w:sz w:val="19"/>
-          <w:szCs w:val="19"/>
-          <w:highlight w:val="white"/>
-        </w:rPr>
-        <w:t>b.Property(</w:t>
-      </w:r>
-      <w:proofErr w:type="gramEnd"/>
-      <w:r>
-        <w:rPr>
-          <w:rFonts w:ascii="Cascadia Mono" w:hAnsi="Cascadia Mono" w:cs="Cascadia Mono"/>
-          <w:color w:val="000000"/>
-          <w:sz w:val="19"/>
-          <w:szCs w:val="19"/>
-          <w:highlight w:val="white"/>
-        </w:rPr>
-        <w:t>p =&gt; p.InvoiceDate).HasColumnName(</w:t>
+        <w:t xml:space="preserve">                b.Property(p =&gt; p.InvoiceDate).HasColumnName(</w:t>
       </w:r>
       <w:r>
         <w:rPr>
@@ -1203,29 +989,7 @@
           <w:szCs w:val="19"/>
           <w:highlight w:val="white"/>
         </w:rPr>
-        <w:t xml:space="preserve">                </w:t>
-      </w:r>
-      <w:proofErr w:type="gramStart"/>
-      <w:r>
-        <w:rPr>
-          <w:rFonts w:ascii="Cascadia Mono" w:hAnsi="Cascadia Mono" w:cs="Cascadia Mono"/>
-          <w:color w:val="000000"/>
-          <w:sz w:val="19"/>
-          <w:szCs w:val="19"/>
-          <w:highlight w:val="white"/>
-        </w:rPr>
-        <w:t>b.Property(</w:t>
-      </w:r>
-      <w:proofErr w:type="gramEnd"/>
-      <w:r>
-        <w:rPr>
-          <w:rFonts w:ascii="Cascadia Mono" w:hAnsi="Cascadia Mono" w:cs="Cascadia Mono"/>
-          <w:color w:val="000000"/>
-          <w:sz w:val="19"/>
-          <w:szCs w:val="19"/>
-          <w:highlight w:val="white"/>
-        </w:rPr>
-        <w:t>p =&gt; p.DueDate).HasColumnName(</w:t>
+        <w:t xml:space="preserve">                b.Property(p =&gt; p.DueDate).HasColumnName(</w:t>
       </w:r>
       <w:r>
         <w:rPr>
@@ -1290,29 +1054,7 @@
           <w:szCs w:val="19"/>
           <w:highlight w:val="white"/>
         </w:rPr>
-        <w:t xml:space="preserve">                </w:t>
-      </w:r>
-      <w:proofErr w:type="gramStart"/>
-      <w:r>
-        <w:rPr>
-          <w:rFonts w:ascii="Cascadia Mono" w:hAnsi="Cascadia Mono" w:cs="Cascadia Mono"/>
-          <w:color w:val="000000"/>
-          <w:sz w:val="19"/>
-          <w:szCs w:val="19"/>
-          <w:highlight w:val="white"/>
-        </w:rPr>
-        <w:t>b.Property(</w:t>
-      </w:r>
-      <w:proofErr w:type="gramEnd"/>
-      <w:r>
-        <w:rPr>
-          <w:rFonts w:ascii="Cascadia Mono" w:hAnsi="Cascadia Mono" w:cs="Cascadia Mono"/>
-          <w:color w:val="000000"/>
-          <w:sz w:val="19"/>
-          <w:szCs w:val="19"/>
-          <w:highlight w:val="white"/>
-        </w:rPr>
-        <w:t>p =&gt; p.Status).HasColumnName(</w:t>
+        <w:t xml:space="preserve">                b.Property(p =&gt; p.Status).HasColumnName(</w:t>
       </w:r>
       <w:r>
         <w:rPr>
@@ -1357,29 +1099,7 @@
           <w:szCs w:val="19"/>
           <w:highlight w:val="white"/>
         </w:rPr>
-        <w:t xml:space="preserve">                    </w:t>
-      </w:r>
-      <w:proofErr w:type="gramStart"/>
-      <w:r>
-        <w:rPr>
-          <w:rFonts w:ascii="Cascadia Mono" w:hAnsi="Cascadia Mono" w:cs="Cascadia Mono"/>
-          <w:color w:val="000000"/>
-          <w:sz w:val="19"/>
-          <w:szCs w:val="19"/>
-          <w:highlight w:val="white"/>
-        </w:rPr>
-        <w:t>v</w:t>
-      </w:r>
-      <w:proofErr w:type="gramEnd"/>
-      <w:r>
-        <w:rPr>
-          <w:rFonts w:ascii="Cascadia Mono" w:hAnsi="Cascadia Mono" w:cs="Cascadia Mono"/>
-          <w:color w:val="000000"/>
-          <w:sz w:val="19"/>
-          <w:szCs w:val="19"/>
-          <w:highlight w:val="white"/>
-        </w:rPr>
-        <w:t xml:space="preserve"> =&gt; v.ToString(),</w:t>
+        <w:t xml:space="preserve">                    v =&gt; v.ToString(),</w:t>
       </w:r>
     </w:p>
     <w:p>
@@ -1404,29 +1124,7 @@
           <w:szCs w:val="19"/>
           <w:highlight w:val="white"/>
         </w:rPr>
-        <w:t xml:space="preserve">                    </w:t>
-      </w:r>
-      <w:proofErr w:type="gramStart"/>
-      <w:r>
-        <w:rPr>
-          <w:rFonts w:ascii="Cascadia Mono" w:hAnsi="Cascadia Mono" w:cs="Cascadia Mono"/>
-          <w:color w:val="000000"/>
-          <w:sz w:val="19"/>
-          <w:szCs w:val="19"/>
-          <w:highlight w:val="white"/>
-        </w:rPr>
-        <w:t>v</w:t>
-      </w:r>
-      <w:proofErr w:type="gramEnd"/>
-      <w:r>
-        <w:rPr>
-          <w:rFonts w:ascii="Cascadia Mono" w:hAnsi="Cascadia Mono" w:cs="Cascadia Mono"/>
-          <w:color w:val="000000"/>
-          <w:sz w:val="19"/>
-          <w:szCs w:val="19"/>
-          <w:highlight w:val="white"/>
-        </w:rPr>
-        <w:t xml:space="preserve"> =&gt; (</w:t>
+        <w:t xml:space="preserve">                    v =&gt; (</w:t>
       </w:r>
       <w:r>
         <w:rPr>
@@ -1591,29 +1289,7 @@
           <w:szCs w:val="19"/>
           <w:highlight w:val="white"/>
         </w:rPr>
-        <w:t xml:space="preserve">                </w:t>
-      </w:r>
-      <w:proofErr w:type="gramStart"/>
-      <w:r>
-        <w:rPr>
-          <w:rFonts w:ascii="Cascadia Mono" w:hAnsi="Cascadia Mono" w:cs="Cascadia Mono"/>
-          <w:color w:val="000000"/>
-          <w:sz w:val="19"/>
-          <w:szCs w:val="19"/>
-          <w:highlight w:val="white"/>
-        </w:rPr>
-        <w:t>b.OwnsMany(</w:t>
-      </w:r>
-      <w:proofErr w:type="gramEnd"/>
-      <w:r>
-        <w:rPr>
-          <w:rFonts w:ascii="Cascadia Mono" w:hAnsi="Cascadia Mono" w:cs="Cascadia Mono"/>
-          <w:color w:val="000000"/>
-          <w:sz w:val="19"/>
-          <w:szCs w:val="19"/>
-          <w:highlight w:val="white"/>
-        </w:rPr>
-        <w:t>p =&gt; p.InvoiceItems, a =&gt;</w:t>
+        <w:t xml:space="preserve">                b.OwnsMany(p =&gt; p.InvoiceItems, a =&gt;</w:t>
       </w:r>
     </w:p>
     <w:p>
@@ -1688,20 +1364,8 @@
           <w:szCs w:val="19"/>
           <w:highlight w:val="white"/>
         </w:rPr>
-        <w:t xml:space="preserve">                    </w:t>
-      </w:r>
-      <w:proofErr w:type="gramStart"/>
-      <w:r>
-        <w:rPr>
-          <w:rFonts w:ascii="Cascadia Mono" w:hAnsi="Cascadia Mono" w:cs="Cascadia Mono"/>
-          <w:color w:val="000000"/>
-          <w:sz w:val="19"/>
-          <w:szCs w:val="19"/>
-          <w:highlight w:val="white"/>
-        </w:rPr>
-        <w:t>a.ToTable(</w:t>
-      </w:r>
-      <w:proofErr w:type="gramEnd"/>
+        <w:t xml:space="preserve">                    a.ToTable(</w:t>
+      </w:r>
       <w:r>
         <w:rPr>
           <w:rFonts w:ascii="Cascadia Mono" w:hAnsi="Cascadia Mono" w:cs="Cascadia Mono"/>
@@ -1862,7 +1526,6 @@
         <w:lastRenderedPageBreak/>
         <w:t xml:space="preserve">When you use the </w:t>
       </w:r>
-      <w:proofErr w:type="gramStart"/>
       <w:r>
         <w:rPr>
           <w:rFonts w:ascii="Sakkal Majalla" w:hAnsi="Sakkal Majalla" w:cs="Sakkal Majalla"/>
@@ -1878,16 +1541,7 @@
           <w:sz w:val="28"/>
           <w:szCs w:val="28"/>
         </w:rPr>
-        <w:t>(</w:t>
-      </w:r>
-      <w:proofErr w:type="gramEnd"/>
-      <w:r>
-        <w:rPr>
-          <w:rFonts w:ascii="Sakkal Majalla" w:hAnsi="Sakkal Majalla" w:cs="Sakkal Majalla"/>
-          <w:sz w:val="28"/>
-          <w:szCs w:val="28"/>
-        </w:rPr>
-        <w:t>)/</w:t>
+        <w:t>()/</w:t>
       </w:r>
       <w:r>
         <w:rPr>
@@ -2085,7 +1739,6 @@
         </w:rPr>
         <w:t xml:space="preserve">• When you query the owner, the owned entity type will be included automatically. You do not need to use the </w:t>
       </w:r>
-      <w:proofErr w:type="gramStart"/>
       <w:r>
         <w:rPr>
           <w:rFonts w:ascii="Sakkal Majalla" w:hAnsi="Sakkal Majalla" w:cs="Sakkal Majalla"/>
@@ -2101,16 +1754,7 @@
           <w:sz w:val="28"/>
           <w:szCs w:val="28"/>
         </w:rPr>
-        <w:t>(</w:t>
-      </w:r>
-      <w:proofErr w:type="gramEnd"/>
-      <w:r>
-        <w:rPr>
-          <w:rFonts w:ascii="Sakkal Majalla" w:hAnsi="Sakkal Majalla" w:cs="Sakkal Majalla"/>
-          <w:sz w:val="28"/>
-          <w:szCs w:val="28"/>
-        </w:rPr>
-        <w:t>) method to include the owned entity type explicitly.</w:t>
+        <w:t>() method to include the owned entity type explicitly.</w:t>
       </w:r>
     </w:p>
     <w:p>
@@ -2232,7 +1876,6 @@
         </w:rPr>
         <w:t xml:space="preserve">To enable DbContext pooling, you can replace the </w:t>
       </w:r>
-      <w:proofErr w:type="gramStart"/>
       <w:r>
         <w:rPr>
           <w:rFonts w:ascii="Sakkal Majalla" w:hAnsi="Sakkal Majalla" w:cs="Sakkal Majalla"/>
@@ -2248,16 +1891,7 @@
           <w:sz w:val="28"/>
           <w:szCs w:val="28"/>
         </w:rPr>
-        <w:t>(</w:t>
-      </w:r>
-      <w:proofErr w:type="gramEnd"/>
-      <w:r>
-        <w:rPr>
-          <w:rFonts w:ascii="Sakkal Majalla" w:hAnsi="Sakkal Majalla" w:cs="Sakkal Majalla"/>
-          <w:sz w:val="28"/>
-          <w:szCs w:val="28"/>
-        </w:rPr>
-        <w:t xml:space="preserve">) method with the </w:t>
+        <w:t xml:space="preserve">() method with the </w:t>
       </w:r>
       <w:r>
         <w:rPr>
@@ -2404,7 +2038,6 @@
         </w:rPr>
         <w:t xml:space="preserve">he </w:t>
       </w:r>
-      <w:proofErr w:type="gramStart"/>
       <w:r>
         <w:rPr>
           <w:rFonts w:ascii="Sakkal Majalla" w:hAnsi="Sakkal Majalla" w:cs="Sakkal Majalla"/>
@@ -2420,16 +2053,7 @@
           <w:sz w:val="28"/>
           <w:szCs w:val="28"/>
         </w:rPr>
-        <w:t>(</w:t>
-      </w:r>
-      <w:proofErr w:type="gramEnd"/>
-      <w:r>
-        <w:rPr>
-          <w:rFonts w:ascii="Sakkal Majalla" w:hAnsi="Sakkal Majalla" w:cs="Sakkal Majalla"/>
-          <w:sz w:val="28"/>
-          <w:szCs w:val="28"/>
-        </w:rPr>
-        <w:t xml:space="preserve">) method takes a </w:t>
+        <w:t xml:space="preserve">() method takes a </w:t>
       </w:r>
       <w:r>
         <w:rPr>
@@ -2544,103 +2168,1835 @@
         </w:rPr>
         <w:t>:</w:t>
       </w:r>
+    </w:p>
+    <w:p>
+      <w:pPr>
+        <w:rPr>
+          <w:rFonts w:ascii="Sakkal Majalla" w:hAnsi="Sakkal Majalla" w:cs="Sakkal Majalla"/>
+          <w:sz w:val="28"/>
+          <w:szCs w:val="28"/>
+        </w:rPr>
+      </w:pPr>
+      <w:r>
+        <w:rPr>
+          <w:rFonts w:ascii="Sakkal Majalla" w:hAnsi="Sakkal Majalla" w:cs="Sakkal Majalla"/>
+          <w:sz w:val="28"/>
+          <w:szCs w:val="28"/>
+        </w:rPr>
+        <w:t xml:space="preserve">For most applications, </w:t>
+      </w:r>
+      <w:r>
+        <w:rPr>
+          <w:rFonts w:ascii="Sakkal Majalla" w:hAnsi="Sakkal Majalla" w:cs="Sakkal Majalla"/>
+          <w:color w:val="002060"/>
+          <w:sz w:val="28"/>
+          <w:szCs w:val="28"/>
+        </w:rPr>
+        <w:t xml:space="preserve">DbContext </w:t>
+      </w:r>
+      <w:r>
+        <w:rPr>
+          <w:rFonts w:ascii="Sakkal Majalla" w:hAnsi="Sakkal Majalla" w:cs="Sakkal Majalla"/>
+          <w:sz w:val="28"/>
+          <w:szCs w:val="28"/>
+        </w:rPr>
+        <w:t xml:space="preserve">pooling is not necessary. You should enable </w:t>
+      </w:r>
+      <w:r>
+        <w:rPr>
+          <w:rFonts w:ascii="Sakkal Majalla" w:hAnsi="Sakkal Majalla" w:cs="Sakkal Majalla"/>
+          <w:color w:val="002060"/>
+          <w:sz w:val="28"/>
+          <w:szCs w:val="28"/>
+        </w:rPr>
+        <w:t xml:space="preserve">DbContext pooling </w:t>
+      </w:r>
+      <w:r>
+        <w:rPr>
+          <w:rFonts w:ascii="Sakkal Majalla" w:hAnsi="Sakkal Majalla" w:cs="Sakkal Majalla"/>
+          <w:sz w:val="28"/>
+          <w:szCs w:val="28"/>
+        </w:rPr>
+        <w:t xml:space="preserve">only if you have a high-throughput application. Therefore, before enabling </w:t>
+      </w:r>
+      <w:r>
+        <w:rPr>
+          <w:rFonts w:ascii="Sakkal Majalla" w:hAnsi="Sakkal Majalla" w:cs="Sakkal Majalla"/>
+          <w:color w:val="002060"/>
+          <w:sz w:val="28"/>
+          <w:szCs w:val="28"/>
+        </w:rPr>
+        <w:t>DbContext pooling</w:t>
+      </w:r>
+      <w:r>
+        <w:rPr>
+          <w:rFonts w:ascii="Sakkal Majalla" w:hAnsi="Sakkal Majalla" w:cs="Sakkal Majalla"/>
+          <w:sz w:val="28"/>
+          <w:szCs w:val="28"/>
+        </w:rPr>
+        <w:t>, it is important to test your application’s performance with and without it to see whether there’s any noticeable improvement.</w:t>
+      </w:r>
+    </w:p>
+    <w:p>
+      <w:pPr>
+        <w:ind w:left="720" w:firstLine="720"/>
+        <w:rPr>
+          <w:rFonts w:ascii="Sakkal Majalla" w:hAnsi="Sakkal Majalla" w:cs="Sakkal Majalla"/>
+          <w:sz w:val="28"/>
+          <w:szCs w:val="28"/>
+        </w:rPr>
+      </w:pPr>
+      <w:r>
+        <w:rPr>
+          <w:rFonts w:ascii="Sakkal Majalla" w:hAnsi="Sakkal Majalla" w:cs="Sakkal Majalla"/>
+          <w:sz w:val="28"/>
+          <w:szCs w:val="28"/>
+        </w:rPr>
+        <w:t>***********************************************************************</w:t>
+      </w:r>
+    </w:p>
+    <w:p>
+      <w:pPr>
+        <w:rPr>
+          <w:rFonts w:ascii="Sakkal Majalla" w:hAnsi="Sakkal Majalla" w:cs="Sakkal Majalla"/>
+          <w:sz w:val="28"/>
+          <w:szCs w:val="28"/>
+          <w:rtl/>
+        </w:rPr>
+      </w:pPr>
+      <w:r>
+        <w:rPr>
+          <w:rFonts w:ascii="Sakkal Majalla" w:hAnsi="Sakkal Majalla" w:cs="Sakkal Majalla"/>
+          <w:sz w:val="28"/>
+          <w:szCs w:val="28"/>
+        </w:rPr>
+        <w:t xml:space="preserve">When we call the </w:t>
+      </w:r>
+      <w:r>
+        <w:rPr>
+          <w:rFonts w:ascii="Sakkal Majalla" w:hAnsi="Sakkal Majalla" w:cs="Sakkal Majalla"/>
+          <w:color w:val="2F5496" w:themeColor="accent5" w:themeShade="BF"/>
+          <w:sz w:val="28"/>
+          <w:szCs w:val="28"/>
+        </w:rPr>
+        <w:t>context</w:t>
+      </w:r>
+      <w:r>
+        <w:rPr>
+          <w:rFonts w:ascii="Sakkal Majalla" w:hAnsi="Sakkal Majalla" w:cs="Sakkal Majalla"/>
+          <w:sz w:val="28"/>
+          <w:szCs w:val="28"/>
+        </w:rPr>
+        <w:t>.</w:t>
+      </w:r>
+      <w:r>
+        <w:rPr>
+          <w:rFonts w:ascii="Sakkal Majalla" w:hAnsi="Sakkal Majalla" w:cs="Sakkal Majalla"/>
+          <w:color w:val="2F5496" w:themeColor="accent5" w:themeShade="BF"/>
+          <w:sz w:val="28"/>
+          <w:szCs w:val="28"/>
+        </w:rPr>
+        <w:t>Invoices</w:t>
+      </w:r>
+      <w:r>
+        <w:rPr>
+          <w:rFonts w:ascii="Sakkal Majalla" w:hAnsi="Sakkal Majalla" w:cs="Sakkal Majalla"/>
+          <w:sz w:val="28"/>
+          <w:szCs w:val="28"/>
+        </w:rPr>
+        <w:t>.</w:t>
+      </w:r>
+      <w:r>
+        <w:rPr>
+          <w:rFonts w:ascii="Sakkal Majalla" w:hAnsi="Sakkal Majalla" w:cs="Sakkal Majalla"/>
+          <w:color w:val="2F5496" w:themeColor="accent5" w:themeShade="BF"/>
+          <w:sz w:val="28"/>
+          <w:szCs w:val="28"/>
+        </w:rPr>
+        <w:t>FindAsync</w:t>
+      </w:r>
+      <w:r>
+        <w:rPr>
+          <w:rFonts w:ascii="Sakkal Majalla" w:hAnsi="Sakkal Majalla" w:cs="Sakkal Majalla"/>
+          <w:sz w:val="28"/>
+          <w:szCs w:val="28"/>
+        </w:rPr>
+        <w:t>(</w:t>
+      </w:r>
+      <w:r>
+        <w:rPr>
+          <w:rFonts w:ascii="Sakkal Majalla" w:hAnsi="Sakkal Majalla" w:cs="Sakkal Majalla"/>
+          <w:color w:val="C00000"/>
+          <w:sz w:val="28"/>
+          <w:szCs w:val="28"/>
+        </w:rPr>
+        <w:t>id</w:t>
+      </w:r>
+      <w:r>
+        <w:rPr>
+          <w:rFonts w:ascii="Sakkal Majalla" w:hAnsi="Sakkal Majalla" w:cs="Sakkal Majalla"/>
+          <w:sz w:val="28"/>
+          <w:szCs w:val="28"/>
+        </w:rPr>
+        <w:t>) method for the first time, EF Core will query the database and return the Invoice entity. The second time, EF Core will return the Invoice entity from the context because the Invoice entity is already in the context.</w:t>
+      </w:r>
+    </w:p>
+    <w:p>
+      <w:pPr>
+        <w:ind w:left="720" w:firstLine="720"/>
+        <w:rPr>
+          <w:rFonts w:ascii="Sakkal Majalla" w:hAnsi="Sakkal Majalla" w:cs="Sakkal Majalla"/>
+          <w:sz w:val="28"/>
+          <w:szCs w:val="28"/>
+        </w:rPr>
+      </w:pPr>
+      <w:r>
+        <w:rPr>
+          <w:rFonts w:ascii="Sakkal Majalla" w:hAnsi="Sakkal Majalla" w:cs="Sakkal Majalla"/>
+          <w:sz w:val="28"/>
+          <w:szCs w:val="28"/>
+        </w:rPr>
+        <w:t>***********************************************************************</w:t>
+      </w:r>
+    </w:p>
+    <w:p>
+      <w:pPr>
+        <w:rPr>
+          <w:rFonts w:ascii="Sakkal Majalla" w:hAnsi="Sakkal Majalla" w:cs="Sakkal Majalla"/>
+          <w:sz w:val="28"/>
+          <w:szCs w:val="28"/>
+          <w:rtl/>
+        </w:rPr>
+      </w:pPr>
+      <w:r>
+        <w:rPr>
+          <w:rFonts w:ascii="Sakkal Majalla" w:hAnsi="Sakkal Majalla" w:cs="Sakkal Majalla"/>
+          <w:sz w:val="28"/>
+          <w:szCs w:val="28"/>
+        </w:rPr>
+        <w:t xml:space="preserve">But in rare cases, </w:t>
+      </w:r>
+      <w:r>
+        <w:rPr>
+          <w:rFonts w:ascii="Sakkal Majalla" w:hAnsi="Sakkal Majalla" w:cs="Sakkal Majalla"/>
+          <w:color w:val="538135" w:themeColor="accent6" w:themeShade="BF"/>
+          <w:sz w:val="28"/>
+          <w:szCs w:val="28"/>
+        </w:rPr>
+        <w:t>Find</w:t>
+      </w:r>
+      <w:r>
+        <w:rPr>
+          <w:rFonts w:ascii="Sakkal Majalla" w:hAnsi="Sakkal Majalla" w:cs="Sakkal Majalla"/>
+          <w:sz w:val="28"/>
+          <w:szCs w:val="28"/>
+        </w:rPr>
+        <w:t xml:space="preserve">() and </w:t>
+      </w:r>
+      <w:r>
+        <w:rPr>
+          <w:rFonts w:ascii="Sakkal Majalla" w:hAnsi="Sakkal Majalla" w:cs="Sakkal Majalla"/>
+          <w:color w:val="538135" w:themeColor="accent6" w:themeShade="BF"/>
+          <w:sz w:val="28"/>
+          <w:szCs w:val="28"/>
+        </w:rPr>
+        <w:t>FindAsync</w:t>
+      </w:r>
+      <w:r>
+        <w:rPr>
+          <w:rFonts w:ascii="Sakkal Majalla" w:hAnsi="Sakkal Majalla" w:cs="Sakkal Majalla"/>
+          <w:sz w:val="28"/>
+          <w:szCs w:val="28"/>
+        </w:rPr>
+        <w:t>() may return outdated data if the entity is updated in the database after it is loaded into the context.</w:t>
+      </w:r>
+    </w:p>
+    <w:p>
+      <w:pPr>
+        <w:ind w:left="720" w:firstLine="720"/>
+        <w:rPr>
+          <w:rFonts w:ascii="Sakkal Majalla" w:hAnsi="Sakkal Majalla" w:cs="Sakkal Majalla"/>
+          <w:sz w:val="28"/>
+          <w:szCs w:val="28"/>
+        </w:rPr>
+      </w:pPr>
+      <w:r>
+        <w:rPr>
+          <w:rFonts w:ascii="Sakkal Majalla" w:hAnsi="Sakkal Majalla" w:cs="Sakkal Majalla"/>
+          <w:sz w:val="28"/>
+          <w:szCs w:val="28"/>
+        </w:rPr>
+        <w:t>***********************************************************************</w:t>
+      </w:r>
+    </w:p>
+    <w:p>
+      <w:pPr>
+        <w:rPr>
+          <w:rFonts w:ascii="Sakkal Majalla" w:hAnsi="Sakkal Majalla" w:cs="Sakkal Majalla"/>
+          <w:sz w:val="28"/>
+          <w:szCs w:val="28"/>
+        </w:rPr>
+      </w:pPr>
+      <w:r>
+        <w:rPr>
+          <w:rFonts w:ascii="Sakkal Majalla" w:hAnsi="Sakkal Majalla" w:cs="Sakkal Majalla"/>
+          <w:sz w:val="28"/>
+          <w:szCs w:val="28"/>
+        </w:rPr>
+        <w:t xml:space="preserve">For example, if you use the bulk-update </w:t>
+      </w:r>
+      <w:r>
+        <w:rPr>
+          <w:rFonts w:ascii="Sakkal Majalla" w:hAnsi="Sakkal Majalla" w:cs="Sakkal Majalla"/>
+          <w:color w:val="C45911" w:themeColor="accent2" w:themeShade="BF"/>
+          <w:sz w:val="28"/>
+          <w:szCs w:val="28"/>
+        </w:rPr>
+        <w:t>ExecuteUpdateAsync</w:t>
+      </w:r>
+      <w:r>
+        <w:rPr>
+          <w:rFonts w:ascii="Sakkal Majalla" w:hAnsi="Sakkal Majalla" w:cs="Sakkal Majalla"/>
+          <w:sz w:val="28"/>
+          <w:szCs w:val="28"/>
+        </w:rPr>
+        <w:t>() method, the update will</w:t>
+      </w:r>
+      <w:r>
+        <w:rPr>
+          <w:rFonts w:ascii="Sakkal Majalla" w:hAnsi="Sakkal Majalla" w:cs="Sakkal Majalla"/>
+          <w:sz w:val="28"/>
+          <w:szCs w:val="28"/>
+        </w:rPr>
+        <w:t xml:space="preserve"> not be tracked by DbContext. T</w:t>
+      </w:r>
+      <w:r>
+        <w:rPr>
+          <w:rFonts w:ascii="Sakkal Majalla" w:hAnsi="Sakkal Majalla" w:cs="Sakkal Majalla"/>
+          <w:sz w:val="28"/>
+          <w:szCs w:val="28"/>
+        </w:rPr>
+        <w:t xml:space="preserve">hen, if </w:t>
+      </w:r>
+      <w:r>
+        <w:rPr>
+          <w:rFonts w:ascii="Sakkal Majalla" w:hAnsi="Sakkal Majalla" w:cs="Sakkal Majalla"/>
+          <w:sz w:val="28"/>
+          <w:szCs w:val="28"/>
+        </w:rPr>
+        <w:t>we</w:t>
+      </w:r>
+      <w:r>
+        <w:rPr>
+          <w:rFonts w:ascii="Sakkal Majalla" w:hAnsi="Sakkal Majalla" w:cs="Sakkal Majalla"/>
+          <w:sz w:val="28"/>
+          <w:szCs w:val="28"/>
+        </w:rPr>
+        <w:t xml:space="preserve"> use </w:t>
+      </w:r>
+      <w:r>
+        <w:rPr>
+          <w:rFonts w:ascii="Sakkal Majalla" w:hAnsi="Sakkal Majalla" w:cs="Sakkal Majalla"/>
+          <w:color w:val="C45911" w:themeColor="accent2" w:themeShade="BF"/>
+          <w:sz w:val="28"/>
+          <w:szCs w:val="28"/>
+        </w:rPr>
+        <w:t>Find</w:t>
+      </w:r>
+      <w:r>
+        <w:rPr>
+          <w:rFonts w:ascii="Sakkal Majalla" w:hAnsi="Sakkal Majalla" w:cs="Sakkal Majalla"/>
+          <w:sz w:val="28"/>
+          <w:szCs w:val="28"/>
+        </w:rPr>
+        <w:t xml:space="preserve">() or FindAsync() to get the entity from </w:t>
+      </w:r>
+      <w:r>
+        <w:rPr>
+          <w:rFonts w:ascii="Sakkal Majalla" w:hAnsi="Sakkal Majalla" w:cs="Sakkal Majalla"/>
+          <w:color w:val="C00000"/>
+          <w:sz w:val="28"/>
+          <w:szCs w:val="28"/>
+        </w:rPr>
+        <w:t>DbContext</w:t>
+      </w:r>
+      <w:r>
+        <w:rPr>
+          <w:rFonts w:ascii="Sakkal Majalla" w:hAnsi="Sakkal Majalla" w:cs="Sakkal Majalla"/>
+          <w:sz w:val="28"/>
+          <w:szCs w:val="28"/>
+        </w:rPr>
+        <w:t xml:space="preserve">, you will get the outdated data. In this case, you should use </w:t>
+      </w:r>
+      <w:r>
+        <w:rPr>
+          <w:rFonts w:ascii="Sakkal Majalla" w:hAnsi="Sakkal Majalla" w:cs="Sakkal Majalla"/>
+          <w:color w:val="C45911" w:themeColor="accent2" w:themeShade="BF"/>
+          <w:sz w:val="28"/>
+          <w:szCs w:val="28"/>
+        </w:rPr>
+        <w:t>Single</w:t>
+      </w:r>
+      <w:r>
+        <w:rPr>
+          <w:rFonts w:ascii="Sakkal Majalla" w:hAnsi="Sakkal Majalla" w:cs="Sakkal Majalla"/>
+          <w:sz w:val="28"/>
+          <w:szCs w:val="28"/>
+        </w:rPr>
+        <w:t xml:space="preserve">() or </w:t>
+      </w:r>
+      <w:r>
+        <w:rPr>
+          <w:rFonts w:ascii="Sakkal Majalla" w:hAnsi="Sakkal Majalla" w:cs="Sakkal Majalla"/>
+          <w:color w:val="C45911" w:themeColor="accent2" w:themeShade="BF"/>
+          <w:sz w:val="28"/>
+          <w:szCs w:val="28"/>
+        </w:rPr>
+        <w:t>SingleOrDefault</w:t>
+      </w:r>
+      <w:r>
+        <w:rPr>
+          <w:rFonts w:ascii="Sakkal Majalla" w:hAnsi="Sakkal Majalla" w:cs="Sakkal Majalla"/>
+          <w:sz w:val="28"/>
+          <w:szCs w:val="28"/>
+        </w:rPr>
+        <w:t xml:space="preserve">() to get the entity from the database again. In most cases, you can use the </w:t>
+      </w:r>
+      <w:r>
+        <w:rPr>
+          <w:rFonts w:ascii="Sakkal Majalla" w:hAnsi="Sakkal Majalla" w:cs="Sakkal Majalla"/>
+          <w:color w:val="C45911" w:themeColor="accent2" w:themeShade="BF"/>
+          <w:sz w:val="28"/>
+          <w:szCs w:val="28"/>
+        </w:rPr>
+        <w:t>Find</w:t>
+      </w:r>
+      <w:r>
+        <w:rPr>
+          <w:rFonts w:ascii="Sakkal Majalla" w:hAnsi="Sakkal Majalla" w:cs="Sakkal Majalla"/>
+          <w:sz w:val="28"/>
+          <w:szCs w:val="28"/>
+        </w:rPr>
+        <w:t xml:space="preserve">() or </w:t>
+      </w:r>
+      <w:r>
+        <w:rPr>
+          <w:rFonts w:ascii="Sakkal Majalla" w:hAnsi="Sakkal Majalla" w:cs="Sakkal Majalla"/>
+          <w:color w:val="C45911" w:themeColor="accent2" w:themeShade="BF"/>
+          <w:sz w:val="28"/>
+          <w:szCs w:val="28"/>
+        </w:rPr>
+        <w:t>FindAsync</w:t>
+      </w:r>
+      <w:r>
+        <w:rPr>
+          <w:rFonts w:ascii="Sakkal Majalla" w:hAnsi="Sakkal Majalla" w:cs="Sakkal Majalla"/>
+          <w:sz w:val="28"/>
+          <w:szCs w:val="28"/>
+        </w:rPr>
+        <w:t xml:space="preserve">() methods to get an entity by its primary key when you are sure the entity is always tracked by the </w:t>
+      </w:r>
+      <w:r>
+        <w:rPr>
+          <w:rFonts w:ascii="Sakkal Majalla" w:hAnsi="Sakkal Majalla" w:cs="Sakkal Majalla"/>
+          <w:color w:val="C00000"/>
+          <w:sz w:val="28"/>
+          <w:szCs w:val="28"/>
+        </w:rPr>
+        <w:t>DbContext</w:t>
+      </w:r>
+      <w:r>
+        <w:rPr>
+          <w:rFonts w:ascii="Sakkal Majalla" w:hAnsi="Sakkal Majalla" w:cs="Sakkal Majalla"/>
+          <w:sz w:val="28"/>
+          <w:szCs w:val="28"/>
+        </w:rPr>
+        <w:t>.</w:t>
+      </w:r>
+    </w:p>
+    <w:p>
+      <w:pPr>
+        <w:ind w:left="720" w:firstLine="720"/>
+        <w:rPr>
+          <w:rFonts w:ascii="Sakkal Majalla" w:hAnsi="Sakkal Majalla" w:cs="Sakkal Majalla"/>
+          <w:sz w:val="28"/>
+          <w:szCs w:val="28"/>
+        </w:rPr>
+      </w:pPr>
+      <w:r>
+        <w:rPr>
+          <w:rFonts w:ascii="Sakkal Majalla" w:hAnsi="Sakkal Majalla" w:cs="Sakkal Majalla"/>
+          <w:sz w:val="28"/>
+          <w:szCs w:val="28"/>
+        </w:rPr>
+        <w:t>***********************************************************************</w:t>
+      </w:r>
+    </w:p>
+    <w:p>
+      <w:pPr>
+        <w:rPr>
+          <w:rFonts w:ascii="Sakkal Majalla" w:hAnsi="Sakkal Majalla" w:cs="Sakkal Majalla"/>
+          <w:sz w:val="28"/>
+          <w:szCs w:val="28"/>
+        </w:rPr>
+      </w:pPr>
+      <w:r>
+        <w:rPr>
+          <w:noProof/>
+        </w:rPr>
+        <w:lastRenderedPageBreak/>
+        <w:drawing>
+          <wp:inline distT="0" distB="0" distL="0" distR="0" wp14:anchorId="22A88187" wp14:editId="6CBDA785">
+            <wp:extent cx="5943600" cy="5093335"/>
+            <wp:effectExtent l="0" t="0" r="0" b="0"/>
+            <wp:docPr id="1" name="Picture 1"/>
+            <wp:cNvGraphicFramePr>
+              <a:graphicFrameLocks xmlns:a="http://schemas.openxmlformats.org/drawingml/2006/main" noChangeAspect="1"/>
+            </wp:cNvGraphicFramePr>
+            <a:graphic xmlns:a="http://schemas.openxmlformats.org/drawingml/2006/main">
+              <a:graphicData uri="http://schemas.openxmlformats.org/drawingml/2006/picture">
+                <pic:pic xmlns:pic="http://schemas.openxmlformats.org/drawingml/2006/picture">
+                  <pic:nvPicPr>
+                    <pic:cNvPr id="1" name=""/>
+                    <pic:cNvPicPr/>
+                  </pic:nvPicPr>
+                  <pic:blipFill>
+                    <a:blip r:embed="rId4"/>
+                    <a:stretch>
+                      <a:fillRect/>
+                    </a:stretch>
+                  </pic:blipFill>
+                  <pic:spPr>
+                    <a:xfrm>
+                      <a:off x="0" y="0"/>
+                      <a:ext cx="5943600" cy="5093335"/>
+                    </a:xfrm>
+                    <a:prstGeom prst="rect">
+                      <a:avLst/>
+                    </a:prstGeom>
+                  </pic:spPr>
+                </pic:pic>
+              </a:graphicData>
+            </a:graphic>
+          </wp:inline>
+        </w:drawing>
+      </w:r>
+    </w:p>
+    <w:p>
+      <w:pPr>
+        <w:ind w:left="720" w:firstLine="720"/>
+        <w:rPr>
+          <w:rFonts w:ascii="Sakkal Majalla" w:hAnsi="Sakkal Majalla" w:cs="Sakkal Majalla"/>
+          <w:sz w:val="28"/>
+          <w:szCs w:val="28"/>
+        </w:rPr>
+      </w:pPr>
+      <w:r>
+        <w:rPr>
+          <w:rFonts w:ascii="Sakkal Majalla" w:hAnsi="Sakkal Majalla" w:cs="Sakkal Majalla"/>
+          <w:sz w:val="28"/>
+          <w:szCs w:val="28"/>
+        </w:rPr>
+        <w:t>***********************************************************************</w:t>
+      </w:r>
+    </w:p>
+    <w:p>
+      <w:pPr>
+        <w:rPr>
+          <w:rFonts w:ascii="Sakkal Majalla" w:hAnsi="Sakkal Majalla" w:cs="Sakkal Majalla"/>
+          <w:sz w:val="28"/>
+          <w:szCs w:val="28"/>
+        </w:rPr>
+      </w:pPr>
+      <w:r>
+        <w:rPr>
+          <w:noProof/>
+        </w:rPr>
+        <w:drawing>
+          <wp:inline distT="0" distB="0" distL="0" distR="0" wp14:anchorId="57F3B14C" wp14:editId="24849C29">
+            <wp:extent cx="5943600" cy="2033905"/>
+            <wp:effectExtent l="0" t="0" r="0" b="4445"/>
+            <wp:docPr id="2" name="Picture 2"/>
+            <wp:cNvGraphicFramePr>
+              <a:graphicFrameLocks xmlns:a="http://schemas.openxmlformats.org/drawingml/2006/main" noChangeAspect="1"/>
+            </wp:cNvGraphicFramePr>
+            <a:graphic xmlns:a="http://schemas.openxmlformats.org/drawingml/2006/main">
+              <a:graphicData uri="http://schemas.openxmlformats.org/drawingml/2006/picture">
+                <pic:pic xmlns:pic="http://schemas.openxmlformats.org/drawingml/2006/picture">
+                  <pic:nvPicPr>
+                    <pic:cNvPr id="1" name=""/>
+                    <pic:cNvPicPr/>
+                  </pic:nvPicPr>
+                  <pic:blipFill>
+                    <a:blip r:embed="rId5"/>
+                    <a:stretch>
+                      <a:fillRect/>
+                    </a:stretch>
+                  </pic:blipFill>
+                  <pic:spPr>
+                    <a:xfrm>
+                      <a:off x="0" y="0"/>
+                      <a:ext cx="5943600" cy="2033905"/>
+                    </a:xfrm>
+                    <a:prstGeom prst="rect">
+                      <a:avLst/>
+                    </a:prstGeom>
+                  </pic:spPr>
+                </pic:pic>
+              </a:graphicData>
+            </a:graphic>
+          </wp:inline>
+        </w:drawing>
+      </w:r>
+    </w:p>
+    <w:p>
+      <w:pPr>
+        <w:ind w:left="720" w:firstLine="720"/>
+        <w:rPr>
+          <w:rFonts w:ascii="Sakkal Majalla" w:hAnsi="Sakkal Majalla" w:cs="Sakkal Majalla"/>
+          <w:sz w:val="28"/>
+          <w:szCs w:val="28"/>
+        </w:rPr>
+      </w:pPr>
+      <w:r>
+        <w:rPr>
+          <w:rFonts w:ascii="Sakkal Majalla" w:hAnsi="Sakkal Majalla" w:cs="Sakkal Majalla"/>
+          <w:sz w:val="28"/>
+          <w:szCs w:val="28"/>
+        </w:rPr>
+        <w:t>***********************************************************************</w:t>
+      </w:r>
+    </w:p>
+    <w:p>
+      <w:pPr>
+        <w:rPr>
+          <w:rFonts w:ascii="Sakkal Majalla" w:hAnsi="Sakkal Majalla" w:cs="Sakkal Majalla"/>
+          <w:sz w:val="28"/>
+          <w:szCs w:val="28"/>
+        </w:rPr>
+      </w:pPr>
+      <w:r>
+        <w:rPr>
+          <w:noProof/>
+        </w:rPr>
+        <w:lastRenderedPageBreak/>
+        <w:drawing>
+          <wp:inline distT="0" distB="0" distL="0" distR="0" wp14:anchorId="1B386DEB" wp14:editId="5B3442C4">
+            <wp:extent cx="5943600" cy="1991360"/>
+            <wp:effectExtent l="0" t="0" r="0" b="8890"/>
+            <wp:docPr id="3" name="Picture 3"/>
+            <wp:cNvGraphicFramePr>
+              <a:graphicFrameLocks xmlns:a="http://schemas.openxmlformats.org/drawingml/2006/main" noChangeAspect="1"/>
+            </wp:cNvGraphicFramePr>
+            <a:graphic xmlns:a="http://schemas.openxmlformats.org/drawingml/2006/main">
+              <a:graphicData uri="http://schemas.openxmlformats.org/drawingml/2006/picture">
+                <pic:pic xmlns:pic="http://schemas.openxmlformats.org/drawingml/2006/picture">
+                  <pic:nvPicPr>
+                    <pic:cNvPr id="1" name=""/>
+                    <pic:cNvPicPr/>
+                  </pic:nvPicPr>
+                  <pic:blipFill>
+                    <a:blip r:embed="rId6"/>
+                    <a:stretch>
+                      <a:fillRect/>
+                    </a:stretch>
+                  </pic:blipFill>
+                  <pic:spPr>
+                    <a:xfrm>
+                      <a:off x="0" y="0"/>
+                      <a:ext cx="5943600" cy="1991360"/>
+                    </a:xfrm>
+                    <a:prstGeom prst="rect">
+                      <a:avLst/>
+                    </a:prstGeom>
+                  </pic:spPr>
+                </pic:pic>
+              </a:graphicData>
+            </a:graphic>
+          </wp:inline>
+        </w:drawing>
+      </w:r>
+    </w:p>
+    <w:p>
+      <w:pPr>
+        <w:ind w:left="720" w:firstLine="720"/>
+        <w:rPr>
+          <w:rFonts w:ascii="Sakkal Majalla" w:hAnsi="Sakkal Majalla" w:cs="Sakkal Majalla"/>
+          <w:sz w:val="28"/>
+          <w:szCs w:val="28"/>
+        </w:rPr>
+      </w:pPr>
+      <w:r>
+        <w:rPr>
+          <w:rFonts w:ascii="Sakkal Majalla" w:hAnsi="Sakkal Majalla" w:cs="Sakkal Majalla"/>
+          <w:sz w:val="28"/>
+          <w:szCs w:val="28"/>
+        </w:rPr>
+        <w:t>***********************************************************************</w:t>
+      </w:r>
+    </w:p>
+    <w:p>
+      <w:pPr>
+        <w:rPr>
+          <w:rFonts w:ascii="Sakkal Majalla" w:hAnsi="Sakkal Majalla" w:cs="Sakkal Majalla"/>
+          <w:sz w:val="28"/>
+          <w:szCs w:val="28"/>
+        </w:rPr>
+      </w:pPr>
+      <w:r>
+        <w:rPr>
+          <w:noProof/>
+        </w:rPr>
+        <w:drawing>
+          <wp:inline distT="0" distB="0" distL="0" distR="0" wp14:anchorId="29036E07" wp14:editId="46752A6B">
+            <wp:extent cx="5943600" cy="1884045"/>
+            <wp:effectExtent l="0" t="0" r="0" b="1905"/>
+            <wp:docPr id="5" name="Picture 5"/>
+            <wp:cNvGraphicFramePr>
+              <a:graphicFrameLocks xmlns:a="http://schemas.openxmlformats.org/drawingml/2006/main" noChangeAspect="1"/>
+            </wp:cNvGraphicFramePr>
+            <a:graphic xmlns:a="http://schemas.openxmlformats.org/drawingml/2006/main">
+              <a:graphicData uri="http://schemas.openxmlformats.org/drawingml/2006/picture">
+                <pic:pic xmlns:pic="http://schemas.openxmlformats.org/drawingml/2006/picture">
+                  <pic:nvPicPr>
+                    <pic:cNvPr id="1" name=""/>
+                    <pic:cNvPicPr/>
+                  </pic:nvPicPr>
+                  <pic:blipFill>
+                    <a:blip r:embed="rId7"/>
+                    <a:stretch>
+                      <a:fillRect/>
+                    </a:stretch>
+                  </pic:blipFill>
+                  <pic:spPr>
+                    <a:xfrm>
+                      <a:off x="0" y="0"/>
+                      <a:ext cx="5943600" cy="1884045"/>
+                    </a:xfrm>
+                    <a:prstGeom prst="rect">
+                      <a:avLst/>
+                    </a:prstGeom>
+                  </pic:spPr>
+                </pic:pic>
+              </a:graphicData>
+            </a:graphic>
+          </wp:inline>
+        </w:drawing>
+      </w:r>
+    </w:p>
+    <w:p>
+      <w:pPr>
+        <w:ind w:left="720" w:firstLine="720"/>
+        <w:rPr>
+          <w:rFonts w:ascii="Sakkal Majalla" w:hAnsi="Sakkal Majalla" w:cs="Sakkal Majalla"/>
+          <w:sz w:val="28"/>
+          <w:szCs w:val="28"/>
+        </w:rPr>
+      </w:pPr>
+      <w:r>
+        <w:rPr>
+          <w:rFonts w:ascii="Sakkal Majalla" w:hAnsi="Sakkal Majalla" w:cs="Sakkal Majalla"/>
+          <w:sz w:val="28"/>
+          <w:szCs w:val="28"/>
+        </w:rPr>
+        <w:t>***********************************************************************</w:t>
+      </w:r>
+    </w:p>
+    <w:p>
+      <w:pPr>
+        <w:rPr>
+          <w:rFonts w:ascii="Sakkal Majalla" w:hAnsi="Sakkal Majalla" w:cs="Sakkal Majalla"/>
+          <w:sz w:val="28"/>
+          <w:szCs w:val="28"/>
+        </w:rPr>
+      </w:pPr>
+      <w:r>
+        <w:rPr>
+          <w:rFonts w:ascii="Sakkal Majalla" w:hAnsi="Sakkal Majalla" w:cs="Sakkal Majalla"/>
+          <w:sz w:val="28"/>
+          <w:szCs w:val="28"/>
+        </w:rPr>
+        <w:t>If an entity is a keyless entity, EF Core will never track it. Keyless entity types do not have keys defined on them. They are configured by a [</w:t>
+      </w:r>
+      <w:r>
+        <w:rPr>
+          <w:rFonts w:ascii="Sakkal Majalla" w:hAnsi="Sakkal Majalla" w:cs="Sakkal Majalla"/>
+          <w:color w:val="2F5496" w:themeColor="accent5" w:themeShade="BF"/>
+          <w:sz w:val="28"/>
+          <w:szCs w:val="28"/>
+        </w:rPr>
+        <w:t>Keyless</w:t>
+      </w:r>
+      <w:r>
+        <w:rPr>
+          <w:rFonts w:ascii="Sakkal Majalla" w:hAnsi="Sakkal Majalla" w:cs="Sakkal Majalla"/>
+          <w:sz w:val="28"/>
+          <w:szCs w:val="28"/>
+        </w:rPr>
+        <w:t xml:space="preserve">] data annotation or a </w:t>
+      </w:r>
+      <w:r>
+        <w:rPr>
+          <w:rFonts w:ascii="Sakkal Majalla" w:hAnsi="Sakkal Majalla" w:cs="Sakkal Majalla"/>
+          <w:color w:val="2F5496" w:themeColor="accent5" w:themeShade="BF"/>
+          <w:sz w:val="28"/>
+          <w:szCs w:val="28"/>
+        </w:rPr>
+        <w:t>Fluent API HasNoKey</w:t>
+      </w:r>
+      <w:r>
+        <w:rPr>
+          <w:rFonts w:ascii="Sakkal Majalla" w:hAnsi="Sakkal Majalla" w:cs="Sakkal Majalla"/>
+          <w:sz w:val="28"/>
+          <w:szCs w:val="28"/>
+        </w:rPr>
+        <w:t xml:space="preserve">() </w:t>
+      </w:r>
+      <w:r>
+        <w:rPr>
+          <w:rFonts w:ascii="Sakkal Majalla" w:hAnsi="Sakkal Majalla" w:cs="Sakkal Majalla"/>
+          <w:color w:val="2F5496" w:themeColor="accent5" w:themeShade="BF"/>
+          <w:sz w:val="28"/>
+          <w:szCs w:val="28"/>
+        </w:rPr>
+        <w:t>method</w:t>
+      </w:r>
+      <w:r>
+        <w:rPr>
+          <w:rFonts w:ascii="Sakkal Majalla" w:hAnsi="Sakkal Majalla" w:cs="Sakkal Majalla"/>
+          <w:sz w:val="28"/>
+          <w:szCs w:val="28"/>
+        </w:rPr>
+        <w:t xml:space="preserve">. The keyless entity is often used for </w:t>
+      </w:r>
+      <w:r>
+        <w:rPr>
+          <w:rFonts w:ascii="Sakkal Majalla" w:hAnsi="Sakkal Majalla" w:cs="Sakkal Majalla"/>
+          <w:color w:val="2F5496" w:themeColor="accent5" w:themeShade="BF"/>
+          <w:sz w:val="28"/>
+          <w:szCs w:val="28"/>
+        </w:rPr>
+        <w:t xml:space="preserve">read-only queries </w:t>
+      </w:r>
+      <w:r>
+        <w:rPr>
+          <w:rFonts w:ascii="Sakkal Majalla" w:hAnsi="Sakkal Majalla" w:cs="Sakkal Majalla"/>
+          <w:sz w:val="28"/>
+          <w:szCs w:val="28"/>
+        </w:rPr>
+        <w:t xml:space="preserve">or </w:t>
+      </w:r>
+      <w:r>
+        <w:rPr>
+          <w:rFonts w:ascii="Sakkal Majalla" w:hAnsi="Sakkal Majalla" w:cs="Sakkal Majalla"/>
+          <w:color w:val="2F5496" w:themeColor="accent5" w:themeShade="BF"/>
+          <w:sz w:val="28"/>
+          <w:szCs w:val="28"/>
+        </w:rPr>
+        <w:t>views</w:t>
+      </w:r>
+      <w:r>
+        <w:rPr>
+          <w:rFonts w:ascii="Sakkal Majalla" w:hAnsi="Sakkal Majalla" w:cs="Sakkal Majalla"/>
+          <w:sz w:val="28"/>
+          <w:szCs w:val="28"/>
+        </w:rPr>
+        <w:t>.</w:t>
+      </w:r>
+    </w:p>
+    <w:p>
+      <w:pPr>
+        <w:ind w:left="720" w:firstLine="720"/>
+        <w:rPr>
+          <w:rFonts w:ascii="Sakkal Majalla" w:hAnsi="Sakkal Majalla" w:cs="Sakkal Majalla"/>
+          <w:sz w:val="28"/>
+          <w:szCs w:val="28"/>
+        </w:rPr>
+      </w:pPr>
+      <w:r>
+        <w:rPr>
+          <w:rFonts w:ascii="Sakkal Majalla" w:hAnsi="Sakkal Majalla" w:cs="Sakkal Majalla"/>
+          <w:sz w:val="28"/>
+          <w:szCs w:val="28"/>
+        </w:rPr>
+        <w:t>***********************************************************************</w:t>
+      </w:r>
+    </w:p>
+    <w:p>
+      <w:pPr>
+        <w:rPr>
+          <w:rFonts w:ascii="Sakkal Majalla" w:hAnsi="Sakkal Majalla" w:cs="Sakkal Majalla"/>
+          <w:sz w:val="28"/>
+          <w:szCs w:val="28"/>
+        </w:rPr>
+      </w:pPr>
+      <w:r>
+        <w:rPr>
+          <w:noProof/>
+        </w:rPr>
+        <w:drawing>
+          <wp:inline distT="0" distB="0" distL="0" distR="0" wp14:anchorId="375729B0" wp14:editId="587D167E">
+            <wp:extent cx="5943600" cy="1699404"/>
+            <wp:effectExtent l="0" t="0" r="0" b="0"/>
+            <wp:docPr id="6" name="Picture 6"/>
+            <wp:cNvGraphicFramePr>
+              <a:graphicFrameLocks xmlns:a="http://schemas.openxmlformats.org/drawingml/2006/main" noChangeAspect="1"/>
+            </wp:cNvGraphicFramePr>
+            <a:graphic xmlns:a="http://schemas.openxmlformats.org/drawingml/2006/main">
+              <a:graphicData uri="http://schemas.openxmlformats.org/drawingml/2006/picture">
+                <pic:pic xmlns:pic="http://schemas.openxmlformats.org/drawingml/2006/picture">
+                  <pic:nvPicPr>
+                    <pic:cNvPr id="1" name=""/>
+                    <pic:cNvPicPr/>
+                  </pic:nvPicPr>
+                  <pic:blipFill>
+                    <a:blip r:embed="rId8"/>
+                    <a:stretch>
+                      <a:fillRect/>
+                    </a:stretch>
+                  </pic:blipFill>
+                  <pic:spPr>
+                    <a:xfrm>
+                      <a:off x="0" y="0"/>
+                      <a:ext cx="5950120" cy="1701268"/>
+                    </a:xfrm>
+                    <a:prstGeom prst="rect">
+                      <a:avLst/>
+                    </a:prstGeom>
+                  </pic:spPr>
+                </pic:pic>
+              </a:graphicData>
+            </a:graphic>
+          </wp:inline>
+        </w:drawing>
+      </w:r>
+    </w:p>
+    <w:p>
+      <w:pPr>
+        <w:ind w:left="720" w:firstLine="720"/>
+        <w:rPr>
+          <w:rFonts w:ascii="Sakkal Majalla" w:hAnsi="Sakkal Majalla" w:cs="Sakkal Majalla"/>
+          <w:sz w:val="28"/>
+          <w:szCs w:val="28"/>
+        </w:rPr>
+      </w:pPr>
+      <w:r>
+        <w:rPr>
+          <w:rFonts w:ascii="Sakkal Majalla" w:hAnsi="Sakkal Majalla" w:cs="Sakkal Majalla"/>
+          <w:sz w:val="28"/>
+          <w:szCs w:val="28"/>
+        </w:rPr>
+        <w:t>***********************************************************************</w:t>
+      </w:r>
+    </w:p>
+    <w:p>
+      <w:pPr>
+        <w:rPr>
+          <w:rFonts w:ascii="Sakkal Majalla" w:hAnsi="Sakkal Majalla" w:cs="Sakkal Majalla"/>
+          <w:sz w:val="28"/>
+          <w:szCs w:val="28"/>
+        </w:rPr>
+      </w:pPr>
+      <w:r>
+        <w:rPr>
+          <w:noProof/>
+        </w:rPr>
+        <w:lastRenderedPageBreak/>
+        <w:drawing>
+          <wp:inline distT="0" distB="0" distL="0" distR="0" wp14:anchorId="61F8414B" wp14:editId="487034C7">
+            <wp:extent cx="5943600" cy="2310765"/>
+            <wp:effectExtent l="0" t="0" r="0" b="0"/>
+            <wp:docPr id="7" name="Picture 7"/>
+            <wp:cNvGraphicFramePr>
+              <a:graphicFrameLocks xmlns:a="http://schemas.openxmlformats.org/drawingml/2006/main" noChangeAspect="1"/>
+            </wp:cNvGraphicFramePr>
+            <a:graphic xmlns:a="http://schemas.openxmlformats.org/drawingml/2006/main">
+              <a:graphicData uri="http://schemas.openxmlformats.org/drawingml/2006/picture">
+                <pic:pic xmlns:pic="http://schemas.openxmlformats.org/drawingml/2006/picture">
+                  <pic:nvPicPr>
+                    <pic:cNvPr id="1" name=""/>
+                    <pic:cNvPicPr/>
+                  </pic:nvPicPr>
+                  <pic:blipFill>
+                    <a:blip r:embed="rId9"/>
+                    <a:stretch>
+                      <a:fillRect/>
+                    </a:stretch>
+                  </pic:blipFill>
+                  <pic:spPr>
+                    <a:xfrm>
+                      <a:off x="0" y="0"/>
+                      <a:ext cx="5943600" cy="2310765"/>
+                    </a:xfrm>
+                    <a:prstGeom prst="rect">
+                      <a:avLst/>
+                    </a:prstGeom>
+                  </pic:spPr>
+                </pic:pic>
+              </a:graphicData>
+            </a:graphic>
+          </wp:inline>
+        </w:drawing>
+      </w:r>
+    </w:p>
+    <w:p>
+      <w:pPr>
+        <w:ind w:left="720" w:firstLine="720"/>
+        <w:rPr>
+          <w:rFonts w:ascii="Sakkal Majalla" w:hAnsi="Sakkal Majalla" w:cs="Sakkal Majalla"/>
+          <w:sz w:val="28"/>
+          <w:szCs w:val="28"/>
+        </w:rPr>
+      </w:pPr>
+      <w:r>
+        <w:rPr>
+          <w:rFonts w:ascii="Sakkal Majalla" w:hAnsi="Sakkal Majalla" w:cs="Sakkal Majalla"/>
+          <w:sz w:val="28"/>
+          <w:szCs w:val="28"/>
+        </w:rPr>
+        <w:t>***********************************************************************</w:t>
+      </w:r>
+    </w:p>
+    <w:p>
+      <w:pPr>
+        <w:rPr>
+          <w:rFonts w:ascii="Sakkal Majalla" w:hAnsi="Sakkal Majalla" w:cs="Sakkal Majalla"/>
+          <w:sz w:val="28"/>
+          <w:szCs w:val="28"/>
+        </w:rPr>
+      </w:pPr>
+      <w:r>
+        <w:rPr>
+          <w:noProof/>
+        </w:rPr>
+        <w:drawing>
+          <wp:inline distT="0" distB="0" distL="0" distR="0" wp14:anchorId="37412587" wp14:editId="37829CA1">
+            <wp:extent cx="5943600" cy="2839085"/>
+            <wp:effectExtent l="0" t="0" r="0" b="0"/>
+            <wp:docPr id="8" name="Picture 8"/>
+            <wp:cNvGraphicFramePr>
+              <a:graphicFrameLocks xmlns:a="http://schemas.openxmlformats.org/drawingml/2006/main" noChangeAspect="1"/>
+            </wp:cNvGraphicFramePr>
+            <a:graphic xmlns:a="http://schemas.openxmlformats.org/drawingml/2006/main">
+              <a:graphicData uri="http://schemas.openxmlformats.org/drawingml/2006/picture">
+                <pic:pic xmlns:pic="http://schemas.openxmlformats.org/drawingml/2006/picture">
+                  <pic:nvPicPr>
+                    <pic:cNvPr id="1" name=""/>
+                    <pic:cNvPicPr/>
+                  </pic:nvPicPr>
+                  <pic:blipFill>
+                    <a:blip r:embed="rId10"/>
+                    <a:stretch>
+                      <a:fillRect/>
+                    </a:stretch>
+                  </pic:blipFill>
+                  <pic:spPr>
+                    <a:xfrm>
+                      <a:off x="0" y="0"/>
+                      <a:ext cx="5943600" cy="2839085"/>
+                    </a:xfrm>
+                    <a:prstGeom prst="rect">
+                      <a:avLst/>
+                    </a:prstGeom>
+                  </pic:spPr>
+                </pic:pic>
+              </a:graphicData>
+            </a:graphic>
+          </wp:inline>
+        </w:drawing>
+      </w:r>
+    </w:p>
+    <w:p>
+      <w:pPr>
+        <w:ind w:left="720" w:firstLine="720"/>
+        <w:rPr>
+          <w:rFonts w:ascii="Sakkal Majalla" w:hAnsi="Sakkal Majalla" w:cs="Sakkal Majalla"/>
+          <w:sz w:val="28"/>
+          <w:szCs w:val="28"/>
+        </w:rPr>
+      </w:pPr>
+      <w:r>
+        <w:rPr>
+          <w:rFonts w:ascii="Sakkal Majalla" w:hAnsi="Sakkal Majalla" w:cs="Sakkal Majalla"/>
+          <w:sz w:val="28"/>
+          <w:szCs w:val="28"/>
+        </w:rPr>
+        <w:t>***********************************************************************</w:t>
+      </w:r>
+    </w:p>
+    <w:p>
+      <w:pPr>
+        <w:rPr>
+          <w:rFonts w:ascii="Sakkal Majalla" w:hAnsi="Sakkal Majalla" w:cs="Sakkal Majalla"/>
+          <w:sz w:val="28"/>
+          <w:szCs w:val="28"/>
+        </w:rPr>
+      </w:pPr>
+    </w:p>
+    <w:p>
+      <w:pPr>
+        <w:rPr>
+          <w:rFonts w:ascii="Sakkal Majalla" w:hAnsi="Sakkal Majalla" w:cs="Sakkal Majalla"/>
+          <w:sz w:val="28"/>
+          <w:szCs w:val="28"/>
+        </w:rPr>
+      </w:pPr>
+    </w:p>
+    <w:p>
+      <w:pPr>
+        <w:rPr>
+          <w:rFonts w:ascii="Sakkal Majalla" w:hAnsi="Sakkal Majalla" w:cs="Sakkal Majalla"/>
+          <w:sz w:val="28"/>
+          <w:szCs w:val="28"/>
+        </w:rPr>
+      </w:pPr>
+    </w:p>
+    <w:p>
+      <w:pPr>
+        <w:rPr>
+          <w:rFonts w:ascii="Sakkal Majalla" w:hAnsi="Sakkal Majalla" w:cs="Sakkal Majalla"/>
+          <w:sz w:val="28"/>
+          <w:szCs w:val="28"/>
+        </w:rPr>
+      </w:pPr>
+    </w:p>
+    <w:p>
+      <w:pPr>
+        <w:rPr>
+          <w:rFonts w:ascii="Sakkal Majalla" w:hAnsi="Sakkal Majalla" w:cs="Sakkal Majalla"/>
+          <w:sz w:val="28"/>
+          <w:szCs w:val="28"/>
+        </w:rPr>
+      </w:pPr>
+      <w:r>
+        <w:rPr>
+          <w:noProof/>
+        </w:rPr>
+        <w:lastRenderedPageBreak/>
+        <w:drawing>
+          <wp:inline distT="0" distB="0" distL="0" distR="0" wp14:anchorId="2797DA5C" wp14:editId="7AA4916A">
+            <wp:extent cx="5943600" cy="897255"/>
+            <wp:effectExtent l="0" t="0" r="0" b="0"/>
+            <wp:docPr id="9" name="Picture 9"/>
+            <wp:cNvGraphicFramePr>
+              <a:graphicFrameLocks xmlns:a="http://schemas.openxmlformats.org/drawingml/2006/main" noChangeAspect="1"/>
+            </wp:cNvGraphicFramePr>
+            <a:graphic xmlns:a="http://schemas.openxmlformats.org/drawingml/2006/main">
+              <a:graphicData uri="http://schemas.openxmlformats.org/drawingml/2006/picture">
+                <pic:pic xmlns:pic="http://schemas.openxmlformats.org/drawingml/2006/picture">
+                  <pic:nvPicPr>
+                    <pic:cNvPr id="1" name=""/>
+                    <pic:cNvPicPr/>
+                  </pic:nvPicPr>
+                  <pic:blipFill>
+                    <a:blip r:embed="rId11"/>
+                    <a:stretch>
+                      <a:fillRect/>
+                    </a:stretch>
+                  </pic:blipFill>
+                  <pic:spPr>
+                    <a:xfrm>
+                      <a:off x="0" y="0"/>
+                      <a:ext cx="5943600" cy="897255"/>
+                    </a:xfrm>
+                    <a:prstGeom prst="rect">
+                      <a:avLst/>
+                    </a:prstGeom>
+                  </pic:spPr>
+                </pic:pic>
+              </a:graphicData>
+            </a:graphic>
+          </wp:inline>
+        </w:drawing>
+      </w:r>
+    </w:p>
+    <w:p>
+      <w:pPr>
+        <w:rPr>
+          <w:rFonts w:ascii="Sakkal Majalla" w:hAnsi="Sakkal Majalla" w:cs="Sakkal Majalla"/>
+          <w:sz w:val="28"/>
+          <w:szCs w:val="28"/>
+        </w:rPr>
+      </w:pPr>
+      <w:r>
+        <w:rPr>
+          <w:rFonts w:ascii="Sakkal Majalla" w:hAnsi="Sakkal Majalla" w:cs="Sakkal Majalla"/>
+          <w:sz w:val="28"/>
+          <w:szCs w:val="28"/>
+        </w:rPr>
+        <w:tab/>
+      </w:r>
+      <w:r>
+        <w:rPr>
+          <w:rFonts w:ascii="Sakkal Majalla" w:hAnsi="Sakkal Majalla" w:cs="Sakkal Majalla"/>
+          <w:sz w:val="28"/>
+          <w:szCs w:val="28"/>
+        </w:rPr>
+        <w:tab/>
+        <w:t>-----------------------------------------------------------------------------------------------------</w:t>
+      </w:r>
+    </w:p>
+    <w:p>
+      <w:pPr>
+        <w:rPr>
+          <w:rFonts w:ascii="Sakkal Majalla" w:hAnsi="Sakkal Majalla" w:cs="Sakkal Majalla"/>
+          <w:sz w:val="28"/>
+          <w:szCs w:val="28"/>
+        </w:rPr>
+      </w:pPr>
+      <w:r>
+        <w:rPr>
+          <w:noProof/>
+        </w:rPr>
+        <w:drawing>
+          <wp:inline distT="0" distB="0" distL="0" distR="0" wp14:anchorId="0CA8FD49" wp14:editId="1B95901B">
+            <wp:extent cx="5943600" cy="5083175"/>
+            <wp:effectExtent l="0" t="0" r="0" b="3175"/>
+            <wp:docPr id="10" name="Picture 10"/>
+            <wp:cNvGraphicFramePr>
+              <a:graphicFrameLocks xmlns:a="http://schemas.openxmlformats.org/drawingml/2006/main" noChangeAspect="1"/>
+            </wp:cNvGraphicFramePr>
+            <a:graphic xmlns:a="http://schemas.openxmlformats.org/drawingml/2006/main">
+              <a:graphicData uri="http://schemas.openxmlformats.org/drawingml/2006/picture">
+                <pic:pic xmlns:pic="http://schemas.openxmlformats.org/drawingml/2006/picture">
+                  <pic:nvPicPr>
+                    <pic:cNvPr id="1" name=""/>
+                    <pic:cNvPicPr/>
+                  </pic:nvPicPr>
+                  <pic:blipFill>
+                    <a:blip r:embed="rId12"/>
+                    <a:stretch>
+                      <a:fillRect/>
+                    </a:stretch>
+                  </pic:blipFill>
+                  <pic:spPr>
+                    <a:xfrm>
+                      <a:off x="0" y="0"/>
+                      <a:ext cx="5943600" cy="5083175"/>
+                    </a:xfrm>
+                    <a:prstGeom prst="rect">
+                      <a:avLst/>
+                    </a:prstGeom>
+                  </pic:spPr>
+                </pic:pic>
+              </a:graphicData>
+            </a:graphic>
+          </wp:inline>
+        </w:drawing>
+      </w:r>
+    </w:p>
+    <w:p>
+      <w:pPr>
+        <w:ind w:left="720" w:firstLine="720"/>
+        <w:rPr>
+          <w:rFonts w:ascii="Sakkal Majalla" w:hAnsi="Sakkal Majalla" w:cs="Sakkal Majalla"/>
+          <w:sz w:val="28"/>
+          <w:szCs w:val="28"/>
+        </w:rPr>
+      </w:pPr>
+      <w:r>
+        <w:rPr>
+          <w:rFonts w:ascii="Sakkal Majalla" w:hAnsi="Sakkal Majalla" w:cs="Sakkal Majalla"/>
+          <w:sz w:val="28"/>
+          <w:szCs w:val="28"/>
+        </w:rPr>
+        <w:t>***********************************************************************</w:t>
+      </w:r>
+    </w:p>
+    <w:p>
+      <w:pPr>
+        <w:rPr>
+          <w:rFonts w:ascii="Sakkal Majalla" w:hAnsi="Sakkal Majalla" w:cs="Sakkal Majalla"/>
+          <w:sz w:val="28"/>
+          <w:szCs w:val="28"/>
+        </w:rPr>
+      </w:pPr>
+      <w:r>
+        <w:rPr>
+          <w:noProof/>
+        </w:rPr>
+        <w:lastRenderedPageBreak/>
+        <w:drawing>
+          <wp:inline distT="0" distB="0" distL="0" distR="0" wp14:anchorId="548A0ECE" wp14:editId="7AE5D179">
+            <wp:extent cx="5943600" cy="1614170"/>
+            <wp:effectExtent l="0" t="0" r="0" b="5080"/>
+            <wp:docPr id="11" name="Picture 11"/>
+            <wp:cNvGraphicFramePr>
+              <a:graphicFrameLocks xmlns:a="http://schemas.openxmlformats.org/drawingml/2006/main" noChangeAspect="1"/>
+            </wp:cNvGraphicFramePr>
+            <a:graphic xmlns:a="http://schemas.openxmlformats.org/drawingml/2006/main">
+              <a:graphicData uri="http://schemas.openxmlformats.org/drawingml/2006/picture">
+                <pic:pic xmlns:pic="http://schemas.openxmlformats.org/drawingml/2006/picture">
+                  <pic:nvPicPr>
+                    <pic:cNvPr id="1" name=""/>
+                    <pic:cNvPicPr/>
+                  </pic:nvPicPr>
+                  <pic:blipFill>
+                    <a:blip r:embed="rId13"/>
+                    <a:stretch>
+                      <a:fillRect/>
+                    </a:stretch>
+                  </pic:blipFill>
+                  <pic:spPr>
+                    <a:xfrm>
+                      <a:off x="0" y="0"/>
+                      <a:ext cx="5943600" cy="1614170"/>
+                    </a:xfrm>
+                    <a:prstGeom prst="rect">
+                      <a:avLst/>
+                    </a:prstGeom>
+                  </pic:spPr>
+                </pic:pic>
+              </a:graphicData>
+            </a:graphic>
+          </wp:inline>
+        </w:drawing>
+      </w:r>
+    </w:p>
+    <w:p>
+      <w:pPr>
+        <w:ind w:left="720" w:firstLine="720"/>
+        <w:rPr>
+          <w:rFonts w:ascii="Sakkal Majalla" w:hAnsi="Sakkal Majalla" w:cs="Sakkal Majalla"/>
+          <w:sz w:val="28"/>
+          <w:szCs w:val="28"/>
+        </w:rPr>
+      </w:pPr>
+      <w:r>
+        <w:rPr>
+          <w:rFonts w:ascii="Sakkal Majalla" w:hAnsi="Sakkal Majalla" w:cs="Sakkal Majalla"/>
+          <w:sz w:val="28"/>
+          <w:szCs w:val="28"/>
+        </w:rPr>
+        <w:t>***********************************************************************</w:t>
+      </w:r>
+    </w:p>
+    <w:p>
+      <w:pPr>
+        <w:rPr>
+          <w:rFonts w:ascii="Sakkal Majalla" w:hAnsi="Sakkal Majalla" w:cs="Sakkal Majalla"/>
+          <w:sz w:val="28"/>
+          <w:szCs w:val="28"/>
+        </w:rPr>
+      </w:pPr>
+      <w:r>
+        <w:rPr>
+          <w:noProof/>
+        </w:rPr>
+        <w:drawing>
+          <wp:inline distT="0" distB="0" distL="0" distR="0" wp14:anchorId="6963D6CF" wp14:editId="4641A20D">
+            <wp:extent cx="5915025" cy="2981325"/>
+            <wp:effectExtent l="0" t="0" r="9525" b="9525"/>
+            <wp:docPr id="12" name="Picture 12"/>
+            <wp:cNvGraphicFramePr>
+              <a:graphicFrameLocks xmlns:a="http://schemas.openxmlformats.org/drawingml/2006/main" noChangeAspect="1"/>
+            </wp:cNvGraphicFramePr>
+            <a:graphic xmlns:a="http://schemas.openxmlformats.org/drawingml/2006/main">
+              <a:graphicData uri="http://schemas.openxmlformats.org/drawingml/2006/picture">
+                <pic:pic xmlns:pic="http://schemas.openxmlformats.org/drawingml/2006/picture">
+                  <pic:nvPicPr>
+                    <pic:cNvPr id="1" name=""/>
+                    <pic:cNvPicPr/>
+                  </pic:nvPicPr>
+                  <pic:blipFill>
+                    <a:blip r:embed="rId14"/>
+                    <a:stretch>
+                      <a:fillRect/>
+                    </a:stretch>
+                  </pic:blipFill>
+                  <pic:spPr>
+                    <a:xfrm>
+                      <a:off x="0" y="0"/>
+                      <a:ext cx="5915025" cy="2981325"/>
+                    </a:xfrm>
+                    <a:prstGeom prst="rect">
+                      <a:avLst/>
+                    </a:prstGeom>
+                  </pic:spPr>
+                </pic:pic>
+              </a:graphicData>
+            </a:graphic>
+          </wp:inline>
+        </w:drawing>
+      </w:r>
+    </w:p>
+    <w:p>
+      <w:pPr>
+        <w:ind w:left="720" w:firstLine="720"/>
+        <w:rPr>
+          <w:rFonts w:ascii="Sakkal Majalla" w:hAnsi="Sakkal Majalla" w:cs="Sakkal Majalla"/>
+          <w:sz w:val="28"/>
+          <w:szCs w:val="28"/>
+        </w:rPr>
+      </w:pPr>
+      <w:r>
+        <w:rPr>
+          <w:rFonts w:ascii="Sakkal Majalla" w:hAnsi="Sakkal Majalla" w:cs="Sakkal Majalla"/>
+          <w:sz w:val="28"/>
+          <w:szCs w:val="28"/>
+        </w:rPr>
+        <w:t>***********************************************************************</w:t>
+      </w:r>
+    </w:p>
+    <w:p>
+      <w:pPr>
+        <w:rPr>
+          <w:rFonts w:ascii="Sakkal Majalla" w:hAnsi="Sakkal Majalla" w:cs="Sakkal Majalla"/>
+          <w:sz w:val="28"/>
+          <w:szCs w:val="28"/>
+        </w:rPr>
+      </w:pPr>
+      <w:r>
+        <w:rPr>
+          <w:noProof/>
+        </w:rPr>
+        <w:drawing>
+          <wp:inline distT="0" distB="0" distL="0" distR="0" wp14:anchorId="48B9E368" wp14:editId="4256222A">
+            <wp:extent cx="5943600" cy="2115820"/>
+            <wp:effectExtent l="0" t="0" r="0" b="0"/>
+            <wp:docPr id="13" name="Picture 13"/>
+            <wp:cNvGraphicFramePr>
+              <a:graphicFrameLocks xmlns:a="http://schemas.openxmlformats.org/drawingml/2006/main" noChangeAspect="1"/>
+            </wp:cNvGraphicFramePr>
+            <a:graphic xmlns:a="http://schemas.openxmlformats.org/drawingml/2006/main">
+              <a:graphicData uri="http://schemas.openxmlformats.org/drawingml/2006/picture">
+                <pic:pic xmlns:pic="http://schemas.openxmlformats.org/drawingml/2006/picture">
+                  <pic:nvPicPr>
+                    <pic:cNvPr id="1" name=""/>
+                    <pic:cNvPicPr/>
+                  </pic:nvPicPr>
+                  <pic:blipFill>
+                    <a:blip r:embed="rId15"/>
+                    <a:stretch>
+                      <a:fillRect/>
+                    </a:stretch>
+                  </pic:blipFill>
+                  <pic:spPr>
+                    <a:xfrm>
+                      <a:off x="0" y="0"/>
+                      <a:ext cx="5943600" cy="2115820"/>
+                    </a:xfrm>
+                    <a:prstGeom prst="rect">
+                      <a:avLst/>
+                    </a:prstGeom>
+                  </pic:spPr>
+                </pic:pic>
+              </a:graphicData>
+            </a:graphic>
+          </wp:inline>
+        </w:drawing>
+      </w:r>
+    </w:p>
+    <w:p>
+      <w:pPr>
+        <w:ind w:left="720" w:firstLine="720"/>
+        <w:rPr>
+          <w:rFonts w:ascii="Sakkal Majalla" w:hAnsi="Sakkal Majalla" w:cs="Sakkal Majalla"/>
+          <w:sz w:val="28"/>
+          <w:szCs w:val="28"/>
+        </w:rPr>
+      </w:pPr>
+      <w:r>
+        <w:rPr>
+          <w:rFonts w:ascii="Sakkal Majalla" w:hAnsi="Sakkal Majalla" w:cs="Sakkal Majalla"/>
+          <w:sz w:val="28"/>
+          <w:szCs w:val="28"/>
+        </w:rPr>
+        <w:t>***********************************************************************</w:t>
+      </w:r>
+    </w:p>
+    <w:p>
+      <w:pPr>
+        <w:rPr>
+          <w:rFonts w:ascii="Sakkal Majalla" w:hAnsi="Sakkal Majalla" w:cs="Sakkal Majalla"/>
+          <w:sz w:val="28"/>
+          <w:szCs w:val="28"/>
+        </w:rPr>
+      </w:pPr>
+      <w:r>
+        <w:rPr>
+          <w:rFonts w:ascii="Sakkal Majalla" w:hAnsi="Sakkal Majalla" w:cs="Sakkal Majalla"/>
+          <w:sz w:val="28"/>
+          <w:szCs w:val="28"/>
+        </w:rPr>
+        <w:lastRenderedPageBreak/>
+        <w:t>T</w:t>
+      </w:r>
+      <w:r>
+        <w:rPr>
+          <w:rFonts w:ascii="Sakkal Majalla" w:hAnsi="Sakkal Majalla" w:cs="Sakkal Majalla"/>
+          <w:sz w:val="28"/>
+          <w:szCs w:val="28"/>
+        </w:rPr>
+        <w:t xml:space="preserve">he parameter is not inserted into the SQL query directly. Instead, </w:t>
+      </w:r>
+      <w:r>
+        <w:rPr>
+          <w:rFonts w:ascii="Sakkal Majalla" w:hAnsi="Sakkal Majalla" w:cs="Sakkal Majalla"/>
+          <w:color w:val="2F5496" w:themeColor="accent5" w:themeShade="BF"/>
+          <w:sz w:val="28"/>
+          <w:szCs w:val="28"/>
+        </w:rPr>
+        <w:t xml:space="preserve">EF Core uses the @p0 parameter </w:t>
+      </w:r>
+      <w:r>
+        <w:rPr>
+          <w:rFonts w:ascii="Sakkal Majalla" w:hAnsi="Sakkal Majalla" w:cs="Sakkal Majalla"/>
+          <w:sz w:val="28"/>
+          <w:szCs w:val="28"/>
+        </w:rPr>
+        <w:t xml:space="preserve">placeholder and passes the parameter value to the SQL query. This is called a parameterized query. It is safe to use the parameterized query </w:t>
+      </w:r>
+      <w:r>
+        <w:rPr>
+          <w:rFonts w:ascii="Sakkal Majalla" w:hAnsi="Sakkal Majalla" w:cs="Sakkal Majalla"/>
+          <w:color w:val="2F5496" w:themeColor="accent5" w:themeShade="BF"/>
+          <w:sz w:val="28"/>
+          <w:szCs w:val="28"/>
+        </w:rPr>
+        <w:t>to avoid SQL injection attacks</w:t>
+      </w:r>
+      <w:r>
+        <w:rPr>
+          <w:rFonts w:ascii="Sakkal Majalla" w:hAnsi="Sakkal Majalla" w:cs="Sakkal Majalla"/>
+          <w:sz w:val="28"/>
+          <w:szCs w:val="28"/>
+        </w:rPr>
+        <w:t xml:space="preserve">. So, we do not need to worry about the safety of the </w:t>
+      </w:r>
+      <w:r>
+        <w:rPr>
+          <w:rFonts w:ascii="Sakkal Majalla" w:hAnsi="Sakkal Majalla" w:cs="Sakkal Majalla"/>
+          <w:color w:val="2F5496" w:themeColor="accent5" w:themeShade="BF"/>
+          <w:sz w:val="28"/>
+          <w:szCs w:val="28"/>
+        </w:rPr>
+        <w:t>FromSql method</w:t>
+      </w:r>
+      <w:r>
+        <w:rPr>
+          <w:rFonts w:ascii="Sakkal Majalla" w:hAnsi="Sakkal Majalla" w:cs="Sakkal Majalla"/>
+          <w:sz w:val="28"/>
+          <w:szCs w:val="28"/>
+        </w:rPr>
+        <w:t>.</w:t>
+      </w:r>
+    </w:p>
+    <w:p>
+      <w:pPr>
+        <w:ind w:left="720" w:firstLine="720"/>
+        <w:rPr>
+          <w:rFonts w:ascii="Sakkal Majalla" w:hAnsi="Sakkal Majalla" w:cs="Sakkal Majalla"/>
+          <w:sz w:val="28"/>
+          <w:szCs w:val="28"/>
+        </w:rPr>
+      </w:pPr>
+      <w:r>
+        <w:rPr>
+          <w:rFonts w:ascii="Sakkal Majalla" w:hAnsi="Sakkal Majalla" w:cs="Sakkal Majalla"/>
+          <w:sz w:val="28"/>
+          <w:szCs w:val="28"/>
+        </w:rPr>
+        <w:t>***********************************************************************</w:t>
+      </w:r>
+    </w:p>
+    <w:p>
+      <w:pPr>
+        <w:rPr>
+          <w:rFonts w:ascii="Sakkal Majalla" w:hAnsi="Sakkal Majalla" w:cs="Sakkal Majalla"/>
+          <w:sz w:val="28"/>
+          <w:szCs w:val="28"/>
+        </w:rPr>
+      </w:pPr>
+      <w:r>
+        <w:rPr>
+          <w:noProof/>
+        </w:rPr>
+        <w:drawing>
+          <wp:inline distT="0" distB="0" distL="0" distR="0" wp14:anchorId="1B9C958C" wp14:editId="66D365A4">
+            <wp:extent cx="5943600" cy="1614170"/>
+            <wp:effectExtent l="0" t="0" r="0" b="5080"/>
+            <wp:docPr id="14" name="Picture 14"/>
+            <wp:cNvGraphicFramePr>
+              <a:graphicFrameLocks xmlns:a="http://schemas.openxmlformats.org/drawingml/2006/main" noChangeAspect="1"/>
+            </wp:cNvGraphicFramePr>
+            <a:graphic xmlns:a="http://schemas.openxmlformats.org/drawingml/2006/main">
+              <a:graphicData uri="http://schemas.openxmlformats.org/drawingml/2006/picture">
+                <pic:pic xmlns:pic="http://schemas.openxmlformats.org/drawingml/2006/picture">
+                  <pic:nvPicPr>
+                    <pic:cNvPr id="1" name=""/>
+                    <pic:cNvPicPr/>
+                  </pic:nvPicPr>
+                  <pic:blipFill>
+                    <a:blip r:embed="rId16"/>
+                    <a:stretch>
+                      <a:fillRect/>
+                    </a:stretch>
+                  </pic:blipFill>
+                  <pic:spPr>
+                    <a:xfrm>
+                      <a:off x="0" y="0"/>
+                      <a:ext cx="5943600" cy="1614170"/>
+                    </a:xfrm>
+                    <a:prstGeom prst="rect">
+                      <a:avLst/>
+                    </a:prstGeom>
+                  </pic:spPr>
+                </pic:pic>
+              </a:graphicData>
+            </a:graphic>
+          </wp:inline>
+        </w:drawing>
+      </w:r>
+    </w:p>
+    <w:p>
+      <w:pPr>
+        <w:ind w:left="720" w:firstLine="720"/>
+        <w:rPr>
+          <w:rFonts w:ascii="Sakkal Majalla" w:hAnsi="Sakkal Majalla" w:cs="Sakkal Majalla"/>
+          <w:sz w:val="28"/>
+          <w:szCs w:val="28"/>
+        </w:rPr>
+      </w:pPr>
+      <w:r>
+        <w:rPr>
+          <w:rFonts w:ascii="Sakkal Majalla" w:hAnsi="Sakkal Majalla" w:cs="Sakkal Majalla"/>
+          <w:sz w:val="28"/>
+          <w:szCs w:val="28"/>
+        </w:rPr>
+        <w:t>***********************************************************************</w:t>
+      </w:r>
+    </w:p>
+    <w:p>
+      <w:pPr>
+        <w:rPr>
+          <w:rFonts w:ascii="Sakkal Majalla" w:hAnsi="Sakkal Majalla" w:cs="Sakkal Majalla"/>
+          <w:sz w:val="28"/>
+          <w:szCs w:val="28"/>
+        </w:rPr>
+      </w:pPr>
+      <w:r>
+        <w:rPr>
+          <w:rFonts w:ascii="Sakkal Majalla" w:hAnsi="Sakkal Majalla" w:cs="Sakkal Majalla"/>
+          <w:sz w:val="28"/>
+          <w:szCs w:val="28"/>
+        </w:rPr>
+        <w:t xml:space="preserve">Note that the </w:t>
+      </w:r>
+      <w:r>
+        <w:rPr>
+          <w:rFonts w:ascii="Sakkal Majalla" w:hAnsi="Sakkal Majalla" w:cs="Sakkal Majalla"/>
+          <w:color w:val="C00000"/>
+          <w:sz w:val="28"/>
+          <w:szCs w:val="28"/>
+        </w:rPr>
+        <w:t>SqlQuery</w:t>
+      </w:r>
+      <w:r>
+        <w:rPr>
+          <w:rFonts w:ascii="Sakkal Majalla" w:hAnsi="Sakkal Majalla" w:cs="Sakkal Majalla"/>
+          <w:sz w:val="28"/>
+          <w:szCs w:val="28"/>
+        </w:rPr>
+        <w:t xml:space="preserve">() method is used on the </w:t>
+      </w:r>
+      <w:r>
+        <w:rPr>
+          <w:rFonts w:ascii="Sakkal Majalla" w:hAnsi="Sakkal Majalla" w:cs="Sakkal Majalla"/>
+          <w:color w:val="C00000"/>
+          <w:sz w:val="28"/>
+          <w:szCs w:val="28"/>
+        </w:rPr>
+        <w:t xml:space="preserve">Database property </w:t>
+      </w:r>
+      <w:r>
+        <w:rPr>
+          <w:rFonts w:ascii="Sakkal Majalla" w:hAnsi="Sakkal Majalla" w:cs="Sakkal Majalla"/>
+          <w:sz w:val="28"/>
+          <w:szCs w:val="28"/>
+        </w:rPr>
+        <w:t xml:space="preserve">of the </w:t>
+      </w:r>
+      <w:r>
+        <w:rPr>
+          <w:rFonts w:ascii="Sakkal Majalla" w:hAnsi="Sakkal Majalla" w:cs="Sakkal Majalla"/>
+          <w:color w:val="C00000"/>
+          <w:sz w:val="28"/>
+          <w:szCs w:val="28"/>
+        </w:rPr>
+        <w:t>DbContext object</w:t>
+      </w:r>
+      <w:r>
+        <w:rPr>
+          <w:rFonts w:ascii="Sakkal Majalla" w:hAnsi="Sakkal Majalla" w:cs="Sakkal Majalla"/>
+          <w:sz w:val="28"/>
+          <w:szCs w:val="28"/>
+        </w:rPr>
+        <w:t xml:space="preserve">. It is not available on the </w:t>
+      </w:r>
+      <w:r>
+        <w:rPr>
+          <w:rFonts w:ascii="Sakkal Majalla" w:hAnsi="Sakkal Majalla" w:cs="Sakkal Majalla"/>
+          <w:color w:val="C00000"/>
+          <w:sz w:val="28"/>
+          <w:szCs w:val="28"/>
+        </w:rPr>
+        <w:t>DbSet object</w:t>
+      </w:r>
+      <w:r>
+        <w:rPr>
+          <w:rFonts w:ascii="Sakkal Majalla" w:hAnsi="Sakkal Majalla" w:cs="Sakkal Majalla"/>
+          <w:sz w:val="28"/>
+          <w:szCs w:val="28"/>
+        </w:rPr>
+        <w:t>.</w:t>
+      </w:r>
+    </w:p>
+    <w:p>
+      <w:pPr>
+        <w:rPr>
+          <w:rFonts w:ascii="Sakkal Majalla" w:hAnsi="Sakkal Majalla" w:cs="Sakkal Majalla"/>
+          <w:sz w:val="28"/>
+          <w:szCs w:val="28"/>
+        </w:rPr>
+      </w:pPr>
+      <w:r>
+        <w:rPr>
+          <w:noProof/>
+        </w:rPr>
+        <w:drawing>
+          <wp:inline distT="0" distB="0" distL="0" distR="0" wp14:anchorId="25C9E233" wp14:editId="043C79AE">
+            <wp:extent cx="5943600" cy="3098165"/>
+            <wp:effectExtent l="0" t="0" r="0" b="6985"/>
+            <wp:docPr id="15" name="Picture 15"/>
+            <wp:cNvGraphicFramePr>
+              <a:graphicFrameLocks xmlns:a="http://schemas.openxmlformats.org/drawingml/2006/main" noChangeAspect="1"/>
+            </wp:cNvGraphicFramePr>
+            <a:graphic xmlns:a="http://schemas.openxmlformats.org/drawingml/2006/main">
+              <a:graphicData uri="http://schemas.openxmlformats.org/drawingml/2006/picture">
+                <pic:pic xmlns:pic="http://schemas.openxmlformats.org/drawingml/2006/picture">
+                  <pic:nvPicPr>
+                    <pic:cNvPr id="1" name=""/>
+                    <pic:cNvPicPr/>
+                  </pic:nvPicPr>
+                  <pic:blipFill>
+                    <a:blip r:embed="rId17"/>
+                    <a:stretch>
+                      <a:fillRect/>
+                    </a:stretch>
+                  </pic:blipFill>
+                  <pic:spPr>
+                    <a:xfrm>
+                      <a:off x="0" y="0"/>
+                      <a:ext cx="5943600" cy="3098165"/>
+                    </a:xfrm>
+                    <a:prstGeom prst="rect">
+                      <a:avLst/>
+                    </a:prstGeom>
+                  </pic:spPr>
+                </pic:pic>
+              </a:graphicData>
+            </a:graphic>
+          </wp:inline>
+        </w:drawing>
+      </w:r>
+    </w:p>
+    <w:p>
+      <w:pPr>
+        <w:ind w:left="720" w:firstLine="720"/>
+        <w:rPr>
+          <w:rFonts w:ascii="Sakkal Majalla" w:hAnsi="Sakkal Majalla" w:cs="Sakkal Majalla"/>
+          <w:sz w:val="28"/>
+          <w:szCs w:val="28"/>
+        </w:rPr>
+      </w:pPr>
+      <w:r>
+        <w:rPr>
+          <w:rFonts w:ascii="Sakkal Majalla" w:hAnsi="Sakkal Majalla" w:cs="Sakkal Majalla"/>
+          <w:sz w:val="28"/>
+          <w:szCs w:val="28"/>
+        </w:rPr>
+        <w:t>***********************************************************************</w:t>
+      </w:r>
+    </w:p>
+    <w:p>
+      <w:pPr>
+        <w:rPr>
+          <w:rFonts w:ascii="Sakkal Majalla" w:hAnsi="Sakkal Majalla" w:cs="Sakkal Majalla"/>
+          <w:sz w:val="28"/>
+          <w:szCs w:val="28"/>
+        </w:rPr>
+      </w:pPr>
+      <w:r>
+        <w:rPr>
+          <w:noProof/>
+        </w:rPr>
+        <w:lastRenderedPageBreak/>
+        <w:drawing>
+          <wp:inline distT="0" distB="0" distL="0" distR="0" wp14:anchorId="673F924C" wp14:editId="3855837C">
+            <wp:extent cx="5943600" cy="2908935"/>
+            <wp:effectExtent l="0" t="0" r="0" b="5715"/>
+            <wp:docPr id="16" name="Picture 16"/>
+            <wp:cNvGraphicFramePr>
+              <a:graphicFrameLocks xmlns:a="http://schemas.openxmlformats.org/drawingml/2006/main" noChangeAspect="1"/>
+            </wp:cNvGraphicFramePr>
+            <a:graphic xmlns:a="http://schemas.openxmlformats.org/drawingml/2006/main">
+              <a:graphicData uri="http://schemas.openxmlformats.org/drawingml/2006/picture">
+                <pic:pic xmlns:pic="http://schemas.openxmlformats.org/drawingml/2006/picture">
+                  <pic:nvPicPr>
+                    <pic:cNvPr id="1" name=""/>
+                    <pic:cNvPicPr/>
+                  </pic:nvPicPr>
+                  <pic:blipFill>
+                    <a:blip r:embed="rId18"/>
+                    <a:stretch>
+                      <a:fillRect/>
+                    </a:stretch>
+                  </pic:blipFill>
+                  <pic:spPr>
+                    <a:xfrm>
+                      <a:off x="0" y="0"/>
+                      <a:ext cx="5943600" cy="2908935"/>
+                    </a:xfrm>
+                    <a:prstGeom prst="rect">
+                      <a:avLst/>
+                    </a:prstGeom>
+                  </pic:spPr>
+                </pic:pic>
+              </a:graphicData>
+            </a:graphic>
+          </wp:inline>
+        </w:drawing>
+      </w:r>
+    </w:p>
+    <w:p>
+      <w:pPr>
+        <w:ind w:left="720" w:firstLine="720"/>
+        <w:rPr>
+          <w:rFonts w:ascii="Sakkal Majalla" w:hAnsi="Sakkal Majalla" w:cs="Sakkal Majalla"/>
+          <w:sz w:val="28"/>
+          <w:szCs w:val="28"/>
+        </w:rPr>
+      </w:pPr>
+      <w:r>
+        <w:rPr>
+          <w:rFonts w:ascii="Sakkal Majalla" w:hAnsi="Sakkal Majalla" w:cs="Sakkal Majalla"/>
+          <w:sz w:val="28"/>
+          <w:szCs w:val="28"/>
+        </w:rPr>
+        <w:t>***********************************************************************</w:t>
+      </w:r>
+    </w:p>
+    <w:p>
+      <w:pPr>
+        <w:rPr>
+          <w:rFonts w:ascii="Sakkal Majalla" w:hAnsi="Sakkal Majalla" w:cs="Sakkal Majalla"/>
+          <w:sz w:val="28"/>
+          <w:szCs w:val="28"/>
+        </w:rPr>
+      </w:pPr>
       <w:bookmarkStart w:id="0" w:name="_GoBack"/>
       <w:bookmarkEnd w:id="0"/>
-    </w:p>
-    <w:p>
-      <w:pPr>
-        <w:rPr>
-          <w:rFonts w:ascii="Sakkal Majalla" w:hAnsi="Sakkal Majalla" w:cs="Sakkal Majalla"/>
-          <w:sz w:val="28"/>
-          <w:szCs w:val="28"/>
-        </w:rPr>
-      </w:pPr>
-      <w:r>
-        <w:rPr>
-          <w:rFonts w:ascii="Sakkal Majalla" w:hAnsi="Sakkal Majalla" w:cs="Sakkal Majalla"/>
-          <w:sz w:val="28"/>
-          <w:szCs w:val="28"/>
-        </w:rPr>
-        <w:t xml:space="preserve">For most applications, </w:t>
-      </w:r>
-      <w:r>
-        <w:rPr>
-          <w:rFonts w:ascii="Sakkal Majalla" w:hAnsi="Sakkal Majalla" w:cs="Sakkal Majalla"/>
-          <w:color w:val="002060"/>
-          <w:sz w:val="28"/>
-          <w:szCs w:val="28"/>
-        </w:rPr>
-        <w:t xml:space="preserve">DbContext </w:t>
-      </w:r>
-      <w:r>
-        <w:rPr>
-          <w:rFonts w:ascii="Sakkal Majalla" w:hAnsi="Sakkal Majalla" w:cs="Sakkal Majalla"/>
-          <w:sz w:val="28"/>
-          <w:szCs w:val="28"/>
-        </w:rPr>
-        <w:t xml:space="preserve">pooling is not necessary. You should enable </w:t>
-      </w:r>
-      <w:r>
-        <w:rPr>
-          <w:rFonts w:ascii="Sakkal Majalla" w:hAnsi="Sakkal Majalla" w:cs="Sakkal Majalla"/>
-          <w:color w:val="002060"/>
-          <w:sz w:val="28"/>
-          <w:szCs w:val="28"/>
-        </w:rPr>
-        <w:t xml:space="preserve">DbContext pooling </w:t>
-      </w:r>
-      <w:r>
-        <w:rPr>
-          <w:rFonts w:ascii="Sakkal Majalla" w:hAnsi="Sakkal Majalla" w:cs="Sakkal Majalla"/>
-          <w:sz w:val="28"/>
-          <w:szCs w:val="28"/>
-        </w:rPr>
-        <w:t xml:space="preserve">only if you have a high-throughput application. Therefore, before enabling </w:t>
-      </w:r>
-      <w:r>
-        <w:rPr>
-          <w:rFonts w:ascii="Sakkal Majalla" w:hAnsi="Sakkal Majalla" w:cs="Sakkal Majalla"/>
-          <w:color w:val="002060"/>
-          <w:sz w:val="28"/>
-          <w:szCs w:val="28"/>
-        </w:rPr>
-        <w:t>DbContext pooling</w:t>
-      </w:r>
-      <w:r>
-        <w:rPr>
-          <w:rFonts w:ascii="Sakkal Majalla" w:hAnsi="Sakkal Majalla" w:cs="Sakkal Majalla"/>
-          <w:sz w:val="28"/>
-          <w:szCs w:val="28"/>
-        </w:rPr>
-        <w:t>, it is important to test your application’s performance with and without it to see whether there’s any noticeable improvement.</w:t>
-      </w:r>
-    </w:p>
-    <w:p>
-      <w:pPr>
-        <w:ind w:left="720" w:firstLine="720"/>
-        <w:rPr>
-          <w:rFonts w:ascii="Sakkal Majalla" w:hAnsi="Sakkal Majalla" w:cs="Sakkal Majalla"/>
-          <w:sz w:val="28"/>
-          <w:szCs w:val="28"/>
-        </w:rPr>
-      </w:pPr>
-      <w:r>
-        <w:rPr>
-          <w:rFonts w:ascii="Sakkal Majalla" w:hAnsi="Sakkal Majalla" w:cs="Sakkal Majalla"/>
-          <w:sz w:val="28"/>
-          <w:szCs w:val="28"/>
-        </w:rPr>
-        <w:t>***********************************************************************</w:t>
-      </w:r>
-    </w:p>
-    <w:p>
-      <w:pPr>
-        <w:rPr>
-          <w:rFonts w:ascii="Sakkal Majalla" w:hAnsi="Sakkal Majalla" w:cs="Sakkal Majalla"/>
-          <w:sz w:val="28"/>
-          <w:szCs w:val="28"/>
-        </w:rPr>
-      </w:pPr>
     </w:p>
     <w:sectPr>
       <w:pgSz w:w="12240" w:h="15840"/>
@@ -3045,7 +4401,7 @@
   <w:style w:type="paragraph" w:default="1" w:styleId="Normal">
     <w:name w:val="Normal"/>
     <w:qFormat/>
-    <w:rsid w:val="006C046F"/>
+    <w:rsid w:val="005D16ED"/>
   </w:style>
   <w:style w:type="character" w:default="1" w:styleId="DefaultParagraphFont">
     <w:name w:val="Default Paragraph Font"/>

</xml_diff>